<commit_message>
feat(ai): setup checkup and status card so the AI works on a fresh clone; refresh screenshots
</commit_message>
<xml_diff>
--- a/pitch/TEDUH-demo-script.docx
+++ b/pitch/TEDUH-demo-script.docx
@@ -51,7 +51,7 @@
         <w:rPr>
           <w:rFonts w:ascii="Calibri" w:cs="Calibri" w:eastAsia="Calibri" w:hAnsi="Calibri"/>
         </w:rPr>
-        <w:t xml:space="preserve">Two presenters, one laptop. Written for someone who has never opened the app: follow it top to bottom. The PowerPoint deck’s speaker notes carry the same lines and timestamps.</w:t>
+        <w:t xml:space="preserve">Steven (Chang Juan Jue) presents; Thien Gen demos. Two people, one laptop. Written for someone who has never opened the app: follow it top to bottom. The PowerPoint deck’s speaker notes carry the same lines and timestamps.</w:t>
       </w:r>
     </w:p>
     <w:p>
@@ -162,26 +162,26 @@
               <w:bottom w:val="single" w:color="D9CFB6" w:sz="4"/>
               <w:right w:val="single" w:color="D9CFB6" w:sz="4"/>
             </w:tcBorders>
-            <w:shd w:fill="F6E3C5" w:color="auto" w:val="clear"/>
-            <w:tcMar>
-              <w:top w:type="dxa" w:w="70"/>
-              <w:left w:type="dxa" w:w="100"/>
-              <w:bottom w:type="dxa" w:w="70"/>
-              <w:right w:type="dxa" w:w="100"/>
-            </w:tcMar>
-          </w:tcPr>
-          <w:p>
-            <w:pPr>
-              <w:spacing w:after="0"/>
-            </w:pPr>
-            <w:r>
-              <w:rPr>
-                <w:rFonts w:ascii="Calibri" w:cs="Calibri" w:eastAsia="Calibri" w:hAnsi="Calibri"/>
-                <w:b/>
-                <w:bCs/>
-                <w:color w:val="8A4B0F"/>
-              </w:rPr>
-              <w:t xml:space="preserve">Thien Gen</w:t>
+            <w:shd w:fill="D8E8F2" w:color="auto" w:val="clear"/>
+            <w:tcMar>
+              <w:top w:type="dxa" w:w="70"/>
+              <w:left w:type="dxa" w:w="100"/>
+              <w:bottom w:type="dxa" w:w="70"/>
+              <w:right w:type="dxa" w:w="100"/>
+            </w:tcMar>
+          </w:tcPr>
+          <w:p>
+            <w:pPr>
+              <w:spacing w:after="0"/>
+            </w:pPr>
+            <w:r>
+              <w:rPr>
+                <w:rFonts w:ascii="Calibri" w:cs="Calibri" w:eastAsia="Calibri" w:hAnsi="Calibri"/>
+                <w:b/>
+                <w:bCs/>
+                <w:color w:val="1F5E86"/>
+              </w:rPr>
+              <w:t xml:space="preserve">Steven</w:t>
             </w:r>
           </w:p>
         </w:tc>
@@ -209,7 +209,7 @@
               <w:rPr>
                 <w:rFonts w:ascii="Calibri" w:cs="Calibri" w:eastAsia="Calibri" w:hAnsi="Calibri"/>
               </w:rPr>
-              <w:t xml:space="preserve">Tells the story and runs the slides: opening, problem, user, impact, innovation, pilot.</w:t>
+              <w:t xml:space="preserve">Presenter (Steven is Chang Juan Jue). Runs every slide and tells the story, from the opening to the ask. Hands over to Thien Gen at 1:30 and takes back at 3:45.</w:t>
             </w:r>
           </w:p>
         </w:tc>
@@ -227,26 +227,26 @@
               <w:bottom w:val="single" w:color="D9CFB6" w:sz="4"/>
               <w:right w:val="single" w:color="D9CFB6" w:sz="4"/>
             </w:tcBorders>
-            <w:shd w:fill="D8E8F2" w:color="auto" w:val="clear"/>
-            <w:tcMar>
-              <w:top w:type="dxa" w:w="70"/>
-              <w:left w:type="dxa" w:w="100"/>
-              <w:bottom w:type="dxa" w:w="70"/>
-              <w:right w:type="dxa" w:w="100"/>
-            </w:tcMar>
-          </w:tcPr>
-          <w:p>
-            <w:pPr>
-              <w:spacing w:after="0"/>
-            </w:pPr>
-            <w:r>
-              <w:rPr>
-                <w:rFonts w:ascii="Calibri" w:cs="Calibri" w:eastAsia="Calibri" w:hAnsi="Calibri"/>
-                <w:b/>
-                <w:bCs/>
-                <w:color w:val="1F5E86"/>
-              </w:rPr>
-              <w:t xml:space="preserve">Steven</w:t>
+            <w:shd w:fill="F6E3C5" w:color="auto" w:val="clear"/>
+            <w:tcMar>
+              <w:top w:type="dxa" w:w="70"/>
+              <w:left w:type="dxa" w:w="100"/>
+              <w:bottom w:type="dxa" w:w="70"/>
+              <w:right w:type="dxa" w:w="100"/>
+            </w:tcMar>
+          </w:tcPr>
+          <w:p>
+            <w:pPr>
+              <w:spacing w:after="0"/>
+            </w:pPr>
+            <w:r>
+              <w:rPr>
+                <w:rFonts w:ascii="Calibri" w:cs="Calibri" w:eastAsia="Calibri" w:hAnsi="Calibri"/>
+                <w:b/>
+                <w:bCs/>
+                <w:color w:val="8A4B0F"/>
+              </w:rPr>
+              <w:t xml:space="preserve">Thien Gen</w:t>
             </w:r>
           </w:p>
         </w:tc>
@@ -274,7 +274,7 @@
               <w:rPr>
                 <w:rFonts w:ascii="Calibri" w:cs="Calibri" w:eastAsia="Calibri" w:hAnsi="Calibri"/>
               </w:rPr>
-              <w:t xml:space="preserve">Drives the app: solution, live demo, how it works, feasibility.</w:t>
+              <w:t xml:space="preserve">Demo (Hong Thien Gen). Drives the app and does all the talking during the live demo (1:30–3:45). Takes the technical questions.</w:t>
             </w:r>
           </w:p>
         </w:tc>
@@ -282,8 +282,21 @@
     </w:tbl>
     <w:p>
       <w:pPr>
-        <w:spacing w:after="120"/>
+        <w:pBdr>
+          <w:left w:val="single" w:color="96590A" w:sz="18" w:space="8"/>
+        </w:pBdr>
+        <w:shd w:fill="F6E9CF" w:color="auto" w:val="clear"/>
+        <w:spacing w:before="160" w:after="160"/>
+        <w:ind w:left="160" w:right="160"/>
       </w:pPr>
+      <w:r>
+        <w:rPr>
+          <w:rFonts w:ascii="Calibri" w:cs="Calibri" w:eastAsia="Calibri" w:hAnsi="Calibri"/>
+          <w:sz w:val="20"/>
+          <w:szCs w:val="20"/>
+        </w:rPr>
+        <w:t xml:space="preserve">Handover: One laptop. Steven sits at the keyboard and advances the slides (arrow keys or a clicker). At 1:30 Thien Gen takes the mouse and keyboard and Alt+Tabs to the app. At 3:40 Thien Gen Alt+Tabs back to the deck and hands back. Steven stays silent during the demo; Thien Gen stays silent during the slides.</w:t>
+      </w:r>
     </w:p>
     <w:tbl>
       <w:tblPr>
@@ -898,26 +911,26 @@
               <w:bottom w:val="single" w:color="D9CFB6" w:sz="4"/>
               <w:right w:val="single" w:color="D9CFB6" w:sz="4"/>
             </w:tcBorders>
-            <w:shd w:fill="D8E8F2" w:color="auto" w:val="clear"/>
-            <w:tcMar>
-              <w:top w:type="dxa" w:w="70"/>
-              <w:left w:type="dxa" w:w="100"/>
-              <w:bottom w:type="dxa" w:w="70"/>
-              <w:right w:type="dxa" w:w="100"/>
-            </w:tcMar>
-          </w:tcPr>
-          <w:p>
-            <w:pPr>
-              <w:spacing w:after="0"/>
-            </w:pPr>
-            <w:r>
-              <w:rPr>
-                <w:rFonts w:ascii="Calibri" w:cs="Calibri" w:eastAsia="Calibri" w:hAnsi="Calibri"/>
-                <w:b/>
-                <w:bCs/>
-                <w:color w:val="1F5E86"/>
-              </w:rPr>
-              <w:t xml:space="preserve">Steven</w:t>
+            <w:shd w:fill="F6E3C5" w:color="auto" w:val="clear"/>
+            <w:tcMar>
+              <w:top w:type="dxa" w:w="70"/>
+              <w:left w:type="dxa" w:w="100"/>
+              <w:bottom w:type="dxa" w:w="70"/>
+              <w:right w:type="dxa" w:w="100"/>
+            </w:tcMar>
+          </w:tcPr>
+          <w:p>
+            <w:pPr>
+              <w:spacing w:after="0"/>
+            </w:pPr>
+            <w:r>
+              <w:rPr>
+                <w:rFonts w:ascii="Calibri" w:cs="Calibri" w:eastAsia="Calibri" w:hAnsi="Calibri"/>
+                <w:b/>
+                <w:bCs/>
+                <w:color w:val="8A4B0F"/>
+              </w:rPr>
+              <w:t xml:space="preserve">Thien Gen</w:t>
             </w:r>
           </w:p>
         </w:tc>
@@ -1022,26 +1035,26 @@
               <w:bottom w:val="single" w:color="D9CFB6" w:sz="4"/>
               <w:right w:val="single" w:color="D9CFB6" w:sz="4"/>
             </w:tcBorders>
-            <w:shd w:fill="D8E8F2" w:color="auto" w:val="clear"/>
-            <w:tcMar>
-              <w:top w:type="dxa" w:w="70"/>
-              <w:left w:type="dxa" w:w="100"/>
-              <w:bottom w:type="dxa" w:w="70"/>
-              <w:right w:type="dxa" w:w="100"/>
-            </w:tcMar>
-          </w:tcPr>
-          <w:p>
-            <w:pPr>
-              <w:spacing w:after="0"/>
-            </w:pPr>
-            <w:r>
-              <w:rPr>
-                <w:rFonts w:ascii="Calibri" w:cs="Calibri" w:eastAsia="Calibri" w:hAnsi="Calibri"/>
-                <w:b/>
-                <w:bCs/>
-                <w:color w:val="1F5E86"/>
-              </w:rPr>
-              <w:t xml:space="preserve">Steven</w:t>
+            <w:shd w:fill="F6E3C5" w:color="auto" w:val="clear"/>
+            <w:tcMar>
+              <w:top w:type="dxa" w:w="70"/>
+              <w:left w:type="dxa" w:w="100"/>
+              <w:bottom w:type="dxa" w:w="70"/>
+              <w:right w:type="dxa" w:w="100"/>
+            </w:tcMar>
+          </w:tcPr>
+          <w:p>
+            <w:pPr>
+              <w:spacing w:after="0"/>
+            </w:pPr>
+            <w:r>
+              <w:rPr>
+                <w:rFonts w:ascii="Calibri" w:cs="Calibri" w:eastAsia="Calibri" w:hAnsi="Calibri"/>
+                <w:b/>
+                <w:bCs/>
+                <w:color w:val="8A4B0F"/>
+              </w:rPr>
+              <w:t xml:space="preserve">Thien Gen</w:t>
             </w:r>
           </w:p>
         </w:tc>
@@ -1146,26 +1159,26 @@
               <w:bottom w:val="single" w:color="D9CFB6" w:sz="4"/>
               <w:right w:val="single" w:color="D9CFB6" w:sz="4"/>
             </w:tcBorders>
-            <w:shd w:fill="D8E8F2" w:color="auto" w:val="clear"/>
-            <w:tcMar>
-              <w:top w:type="dxa" w:w="70"/>
-              <w:left w:type="dxa" w:w="100"/>
-              <w:bottom w:type="dxa" w:w="70"/>
-              <w:right w:type="dxa" w:w="100"/>
-            </w:tcMar>
-          </w:tcPr>
-          <w:p>
-            <w:pPr>
-              <w:spacing w:after="0"/>
-            </w:pPr>
-            <w:r>
-              <w:rPr>
-                <w:rFonts w:ascii="Calibri" w:cs="Calibri" w:eastAsia="Calibri" w:hAnsi="Calibri"/>
-                <w:b/>
-                <w:bCs/>
-                <w:color w:val="1F5E86"/>
-              </w:rPr>
-              <w:t xml:space="preserve">Steven</w:t>
+            <w:shd w:fill="F6E3C5" w:color="auto" w:val="clear"/>
+            <w:tcMar>
+              <w:top w:type="dxa" w:w="70"/>
+              <w:left w:type="dxa" w:w="100"/>
+              <w:bottom w:type="dxa" w:w="70"/>
+              <w:right w:type="dxa" w:w="100"/>
+            </w:tcMar>
+          </w:tcPr>
+          <w:p>
+            <w:pPr>
+              <w:spacing w:after="0"/>
+            </w:pPr>
+            <w:r>
+              <w:rPr>
+                <w:rFonts w:ascii="Calibri" w:cs="Calibri" w:eastAsia="Calibri" w:hAnsi="Calibri"/>
+                <w:b/>
+                <w:bCs/>
+                <w:color w:val="8A4B0F"/>
+              </w:rPr>
+              <w:t xml:space="preserve">Thien Gen</w:t>
             </w:r>
           </w:p>
         </w:tc>
@@ -1270,26 +1283,26 @@
               <w:bottom w:val="single" w:color="D9CFB6" w:sz="4"/>
               <w:right w:val="single" w:color="D9CFB6" w:sz="4"/>
             </w:tcBorders>
-            <w:shd w:fill="D8E8F2" w:color="auto" w:val="clear"/>
-            <w:tcMar>
-              <w:top w:type="dxa" w:w="70"/>
-              <w:left w:type="dxa" w:w="100"/>
-              <w:bottom w:type="dxa" w:w="70"/>
-              <w:right w:type="dxa" w:w="100"/>
-            </w:tcMar>
-          </w:tcPr>
-          <w:p>
-            <w:pPr>
-              <w:spacing w:after="0"/>
-            </w:pPr>
-            <w:r>
-              <w:rPr>
-                <w:rFonts w:ascii="Calibri" w:cs="Calibri" w:eastAsia="Calibri" w:hAnsi="Calibri"/>
-                <w:b/>
-                <w:bCs/>
-                <w:color w:val="1F5E86"/>
-              </w:rPr>
-              <w:t xml:space="preserve">Steven</w:t>
+            <w:shd w:fill="F6E3C5" w:color="auto" w:val="clear"/>
+            <w:tcMar>
+              <w:top w:type="dxa" w:w="70"/>
+              <w:left w:type="dxa" w:w="100"/>
+              <w:bottom w:type="dxa" w:w="70"/>
+              <w:right w:type="dxa" w:w="100"/>
+            </w:tcMar>
+          </w:tcPr>
+          <w:p>
+            <w:pPr>
+              <w:spacing w:after="0"/>
+            </w:pPr>
+            <w:r>
+              <w:rPr>
+                <w:rFonts w:ascii="Calibri" w:cs="Calibri" w:eastAsia="Calibri" w:hAnsi="Calibri"/>
+                <w:b/>
+                <w:bCs/>
+                <w:color w:val="8A4B0F"/>
+              </w:rPr>
+              <w:t xml:space="preserve">Thien Gen</w:t>
             </w:r>
           </w:p>
         </w:tc>
@@ -1394,26 +1407,26 @@
               <w:bottom w:val="single" w:color="D9CFB6" w:sz="4"/>
               <w:right w:val="single" w:color="D9CFB6" w:sz="4"/>
             </w:tcBorders>
-            <w:shd w:fill="D8E8F2" w:color="auto" w:val="clear"/>
-            <w:tcMar>
-              <w:top w:type="dxa" w:w="70"/>
-              <w:left w:type="dxa" w:w="100"/>
-              <w:bottom w:type="dxa" w:w="70"/>
-              <w:right w:type="dxa" w:w="100"/>
-            </w:tcMar>
-          </w:tcPr>
-          <w:p>
-            <w:pPr>
-              <w:spacing w:after="0"/>
-            </w:pPr>
-            <w:r>
-              <w:rPr>
-                <w:rFonts w:ascii="Calibri" w:cs="Calibri" w:eastAsia="Calibri" w:hAnsi="Calibri"/>
-                <w:b/>
-                <w:bCs/>
-                <w:color w:val="1F5E86"/>
-              </w:rPr>
-              <w:t xml:space="preserve">Steven</w:t>
+            <w:shd w:fill="F6E3C5" w:color="auto" w:val="clear"/>
+            <w:tcMar>
+              <w:top w:type="dxa" w:w="70"/>
+              <w:left w:type="dxa" w:w="100"/>
+              <w:bottom w:type="dxa" w:w="70"/>
+              <w:right w:type="dxa" w:w="100"/>
+            </w:tcMar>
+          </w:tcPr>
+          <w:p>
+            <w:pPr>
+              <w:spacing w:after="0"/>
+            </w:pPr>
+            <w:r>
+              <w:rPr>
+                <w:rFonts w:ascii="Calibri" w:cs="Calibri" w:eastAsia="Calibri" w:hAnsi="Calibri"/>
+                <w:b/>
+                <w:bCs/>
+                <w:color w:val="8A4B0F"/>
+              </w:rPr>
+              <w:t xml:space="preserve">Thien Gen</w:t>
             </w:r>
           </w:p>
         </w:tc>
@@ -1642,26 +1655,26 @@
               <w:bottom w:val="single" w:color="D9CFB6" w:sz="4"/>
               <w:right w:val="single" w:color="D9CFB6" w:sz="4"/>
             </w:tcBorders>
-            <w:shd w:fill="D8E8F2" w:color="auto" w:val="clear"/>
-            <w:tcMar>
-              <w:top w:type="dxa" w:w="70"/>
-              <w:left w:type="dxa" w:w="100"/>
-              <w:bottom w:type="dxa" w:w="70"/>
-              <w:right w:type="dxa" w:w="100"/>
-            </w:tcMar>
-          </w:tcPr>
-          <w:p>
-            <w:pPr>
-              <w:spacing w:after="0"/>
-            </w:pPr>
-            <w:r>
-              <w:rPr>
-                <w:rFonts w:ascii="Calibri" w:cs="Calibri" w:eastAsia="Calibri" w:hAnsi="Calibri"/>
-                <w:b/>
-                <w:bCs/>
-                <w:color w:val="1F5E86"/>
-              </w:rPr>
-              <w:t xml:space="preserve">Steven</w:t>
+            <w:shd w:fill="F6E3C5" w:color="auto" w:val="clear"/>
+            <w:tcMar>
+              <w:top w:type="dxa" w:w="70"/>
+              <w:left w:type="dxa" w:w="100"/>
+              <w:bottom w:type="dxa" w:w="70"/>
+              <w:right w:type="dxa" w:w="100"/>
+            </w:tcMar>
+          </w:tcPr>
+          <w:p>
+            <w:pPr>
+              <w:spacing w:after="0"/>
+            </w:pPr>
+            <w:r>
+              <w:rPr>
+                <w:rFonts w:ascii="Calibri" w:cs="Calibri" w:eastAsia="Calibri" w:hAnsi="Calibri"/>
+                <w:b/>
+                <w:bCs/>
+                <w:color w:val="8A4B0F"/>
+              </w:rPr>
+              <w:t xml:space="preserve">Thien Gen</w:t>
             </w:r>
           </w:p>
         </w:tc>
@@ -1766,26 +1779,26 @@
               <w:bottom w:val="single" w:color="D9CFB6" w:sz="4"/>
               <w:right w:val="single" w:color="D9CFB6" w:sz="4"/>
             </w:tcBorders>
-            <w:shd w:fill="F6E3C5" w:color="auto" w:val="clear"/>
-            <w:tcMar>
-              <w:top w:type="dxa" w:w="70"/>
-              <w:left w:type="dxa" w:w="100"/>
-              <w:bottom w:type="dxa" w:w="70"/>
-              <w:right w:type="dxa" w:w="100"/>
-            </w:tcMar>
-          </w:tcPr>
-          <w:p>
-            <w:pPr>
-              <w:spacing w:after="0"/>
-            </w:pPr>
-            <w:r>
-              <w:rPr>
-                <w:rFonts w:ascii="Calibri" w:cs="Calibri" w:eastAsia="Calibri" w:hAnsi="Calibri"/>
-                <w:b/>
-                <w:bCs/>
-                <w:color w:val="8A4B0F"/>
-              </w:rPr>
-              <w:t xml:space="preserve">Thien Gen</w:t>
+            <w:shd w:fill="D8E8F2" w:color="auto" w:val="clear"/>
+            <w:tcMar>
+              <w:top w:type="dxa" w:w="70"/>
+              <w:left w:type="dxa" w:w="100"/>
+              <w:bottom w:type="dxa" w:w="70"/>
+              <w:right w:type="dxa" w:w="100"/>
+            </w:tcMar>
+          </w:tcPr>
+          <w:p>
+            <w:pPr>
+              <w:spacing w:after="0"/>
+            </w:pPr>
+            <w:r>
+              <w:rPr>
+                <w:rFonts w:ascii="Calibri" w:cs="Calibri" w:eastAsia="Calibri" w:hAnsi="Calibri"/>
+                <w:b/>
+                <w:bCs/>
+                <w:color w:val="1F5E86"/>
+              </w:rPr>
+              <w:t xml:space="preserve">Steven</w:t>
             </w:r>
           </w:p>
         </w:tc>
@@ -2251,26 +2264,26 @@
               <w:bottom w:val="single" w:color="D9CFB6" w:sz="4"/>
               <w:right w:val="single" w:color="D9CFB6" w:sz="4"/>
             </w:tcBorders>
-            <w:shd w:fill="F6E3C5" w:color="auto" w:val="clear"/>
-            <w:tcMar>
-              <w:top w:type="dxa" w:w="70"/>
-              <w:left w:type="dxa" w:w="100"/>
-              <w:bottom w:type="dxa" w:w="70"/>
-              <w:right w:type="dxa" w:w="100"/>
-            </w:tcMar>
-          </w:tcPr>
-          <w:p>
-            <w:pPr>
-              <w:spacing w:after="0"/>
-            </w:pPr>
-            <w:r>
-              <w:rPr>
-                <w:rFonts w:ascii="Calibri" w:cs="Calibri" w:eastAsia="Calibri" w:hAnsi="Calibri"/>
-                <w:b/>
-                <w:bCs/>
-                <w:color w:val="8A4B0F"/>
-              </w:rPr>
-              <w:t xml:space="preserve">Thien Gen</w:t>
+            <w:shd w:fill="D8E8F2" w:color="auto" w:val="clear"/>
+            <w:tcMar>
+              <w:top w:type="dxa" w:w="70"/>
+              <w:left w:type="dxa" w:w="100"/>
+              <w:bottom w:type="dxa" w:w="70"/>
+              <w:right w:type="dxa" w:w="100"/>
+            </w:tcMar>
+          </w:tcPr>
+          <w:p>
+            <w:pPr>
+              <w:spacing w:after="0"/>
+            </w:pPr>
+            <w:r>
+              <w:rPr>
+                <w:rFonts w:ascii="Calibri" w:cs="Calibri" w:eastAsia="Calibri" w:hAnsi="Calibri"/>
+                <w:b/>
+                <w:bCs/>
+                <w:color w:val="1F5E86"/>
+              </w:rPr>
+              <w:t xml:space="preserve">Steven</w:t>
             </w:r>
           </w:p>
         </w:tc>
@@ -2300,7 +2313,7 @@
                 <w:i/>
                 <w:iCs/>
               </w:rPr>
-              <w:t xml:space="preserve">“Hi, we are [team name]. I’m Thien Gen, this is Steven. Teduh is Malay for shaded or sheltered. Our track is Planet, focus climate resilience.”</w:t>
+              <w:t xml:space="preserve">“Hi, we are Team One. I’m Steven, this is Thien Gen. Teduh is Malay for shaded or sheltered. Our track is Planet, focus climate resilience.”</w:t>
             </w:r>
           </w:p>
         </w:tc>
@@ -2408,26 +2421,26 @@
               <w:bottom w:val="single" w:color="D9CFB6" w:sz="4"/>
               <w:right w:val="single" w:color="D9CFB6" w:sz="4"/>
             </w:tcBorders>
-            <w:shd w:fill="F6E3C5" w:color="auto" w:val="clear"/>
-            <w:tcMar>
-              <w:top w:type="dxa" w:w="70"/>
-              <w:left w:type="dxa" w:w="100"/>
-              <w:bottom w:type="dxa" w:w="70"/>
-              <w:right w:type="dxa" w:w="100"/>
-            </w:tcMar>
-          </w:tcPr>
-          <w:p>
-            <w:pPr>
-              <w:spacing w:after="0"/>
-            </w:pPr>
-            <w:r>
-              <w:rPr>
-                <w:rFonts w:ascii="Calibri" w:cs="Calibri" w:eastAsia="Calibri" w:hAnsi="Calibri"/>
-                <w:b/>
-                <w:bCs/>
-                <w:color w:val="8A4B0F"/>
-              </w:rPr>
-              <w:t xml:space="preserve">Thien Gen</w:t>
+            <w:shd w:fill="D8E8F2" w:color="auto" w:val="clear"/>
+            <w:tcMar>
+              <w:top w:type="dxa" w:w="70"/>
+              <w:left w:type="dxa" w:w="100"/>
+              <w:bottom w:type="dxa" w:w="70"/>
+              <w:right w:type="dxa" w:w="100"/>
+            </w:tcMar>
+          </w:tcPr>
+          <w:p>
+            <w:pPr>
+              <w:spacing w:after="0"/>
+            </w:pPr>
+            <w:r>
+              <w:rPr>
+                <w:rFonts w:ascii="Calibri" w:cs="Calibri" w:eastAsia="Calibri" w:hAnsi="Calibri"/>
+                <w:b/>
+                <w:bCs/>
+                <w:color w:val="1F5E86"/>
+              </w:rPr>
+              <w:t xml:space="preserve">Steven</w:t>
             </w:r>
           </w:p>
         </w:tc>
@@ -2565,26 +2578,26 @@
               <w:bottom w:val="single" w:color="D9CFB6" w:sz="4"/>
               <w:right w:val="single" w:color="D9CFB6" w:sz="4"/>
             </w:tcBorders>
-            <w:shd w:fill="F6E3C5" w:color="auto" w:val="clear"/>
-            <w:tcMar>
-              <w:top w:type="dxa" w:w="70"/>
-              <w:left w:type="dxa" w:w="100"/>
-              <w:bottom w:type="dxa" w:w="70"/>
-              <w:right w:type="dxa" w:w="100"/>
-            </w:tcMar>
-          </w:tcPr>
-          <w:p>
-            <w:pPr>
-              <w:spacing w:after="0"/>
-            </w:pPr>
-            <w:r>
-              <w:rPr>
-                <w:rFonts w:ascii="Calibri" w:cs="Calibri" w:eastAsia="Calibri" w:hAnsi="Calibri"/>
-                <w:b/>
-                <w:bCs/>
-                <w:color w:val="8A4B0F"/>
-              </w:rPr>
-              <w:t xml:space="preserve">Thien Gen</w:t>
+            <w:shd w:fill="D8E8F2" w:color="auto" w:val="clear"/>
+            <w:tcMar>
+              <w:top w:type="dxa" w:w="70"/>
+              <w:left w:type="dxa" w:w="100"/>
+              <w:bottom w:type="dxa" w:w="70"/>
+              <w:right w:type="dxa" w:w="100"/>
+            </w:tcMar>
+          </w:tcPr>
+          <w:p>
+            <w:pPr>
+              <w:spacing w:after="0"/>
+            </w:pPr>
+            <w:r>
+              <w:rPr>
+                <w:rFonts w:ascii="Calibri" w:cs="Calibri" w:eastAsia="Calibri" w:hAnsi="Calibri"/>
+                <w:b/>
+                <w:bCs/>
+                <w:color w:val="1F5E86"/>
+              </w:rPr>
+              <w:t xml:space="preserve">Steven</w:t>
             </w:r>
           </w:p>
         </w:tc>
@@ -2771,7 +2784,7 @@
                 <w:i/>
                 <w:iCs/>
               </w:rPr>
-              <w:t xml:space="preserve">“Teduh answers one question: with this budget, which shade helps the most walks? It recommends trees and covered walkways, shows before and after, and hands off a build pack. Let me show you.”</w:t>
+              <w:t xml:space="preserve">“Teduh answers one question: with this budget, which shade helps the most walks? It recommends trees and covered walkways, shows before and after, and hands off a build pack. Thien Gen will show you on a real township.”</w:t>
             </w:r>
           </w:p>
         </w:tc>
@@ -2799,7 +2812,7 @@
               <w:rPr>
                 <w:rFonts w:ascii="Calibri" w:cs="Calibri" w:eastAsia="Calibri" w:hAnsi="Calibri"/>
               </w:rPr>
-              <w:t xml:space="preserve">Next slide: Solution, then the Live demo slide. Alt+Tab to the app.</w:t>
+              <w:t xml:space="preserve">Next slide: Solution, then the Live demo slide. Move aside; Thien Gen takes the keyboard.</w:t>
             </w:r>
           </w:p>
         </w:tc>
@@ -2830,7 +2843,7 @@
                 <w:sz w:val="19"/>
                 <w:szCs w:val="19"/>
               </w:rPr>
-              <w:t xml:space="preserve">The app, on 1 Map &amp; routes</w:t>
+              <w:t xml:space="preserve"/>
             </w:r>
           </w:p>
         </w:tc>
@@ -2879,26 +2892,26 @@
               <w:bottom w:val="single" w:color="D9CFB6" w:sz="4"/>
               <w:right w:val="single" w:color="D9CFB6" w:sz="4"/>
             </w:tcBorders>
-            <w:shd w:fill="D8E8F2" w:color="auto" w:val="clear"/>
-            <w:tcMar>
-              <w:top w:type="dxa" w:w="70"/>
-              <w:left w:type="dxa" w:w="100"/>
-              <w:bottom w:type="dxa" w:w="70"/>
-              <w:right w:type="dxa" w:w="100"/>
-            </w:tcMar>
-          </w:tcPr>
-          <w:p>
-            <w:pPr>
-              <w:spacing w:after="0"/>
-            </w:pPr>
-            <w:r>
-              <w:rPr>
-                <w:rFonts w:ascii="Calibri" w:cs="Calibri" w:eastAsia="Calibri" w:hAnsi="Calibri"/>
-                <w:b/>
-                <w:bCs/>
-                <w:color w:val="1F5E86"/>
-              </w:rPr>
-              <w:t xml:space="preserve">Steven</w:t>
+            <w:shd w:fill="F6E3C5" w:color="auto" w:val="clear"/>
+            <w:tcMar>
+              <w:top w:type="dxa" w:w="70"/>
+              <w:left w:type="dxa" w:w="100"/>
+              <w:bottom w:type="dxa" w:w="70"/>
+              <w:right w:type="dxa" w:w="100"/>
+            </w:tcMar>
+          </w:tcPr>
+          <w:p>
+            <w:pPr>
+              <w:spacing w:after="0"/>
+            </w:pPr>
+            <w:r>
+              <w:rPr>
+                <w:rFonts w:ascii="Calibri" w:cs="Calibri" w:eastAsia="Calibri" w:hAnsi="Calibri"/>
+                <w:b/>
+                <w:bCs/>
+                <w:color w:val="8A4B0F"/>
+              </w:rPr>
+              <w:t xml:space="preserve">Thien Gen</w:t>
             </w:r>
           </w:p>
         </w:tc>
@@ -2928,7 +2941,7 @@
                 <w:i/>
                 <w:iCs/>
               </w:rPr>
-              <w:t xml:space="preserve">“This is the real SS 15. Streets and buildings are from OpenStreetMap. Here is the 2 pm walk from the LRT station to the mall.”</w:t>
+              <w:t xml:space="preserve">“Thanks, Steven. This is the real SS 15. Streets and buildings are from OpenStreetMap. Here is the 2 pm walk from the LRT station to the mall.”</w:t>
             </w:r>
           </w:p>
         </w:tc>
@@ -2956,7 +2969,7 @@
               <w:rPr>
                 <w:rFonts w:ascii="Calibri" w:cs="Calibri" w:eastAsia="Calibri" w:hAnsi="Calibri"/>
               </w:rPr>
-              <w:t xml:space="preserve">Left panel: click Demo: 2 pm walk from the LRT station to the shopping mall.</w:t>
+              <w:t xml:space="preserve">Alt+Tab to the app. Left panel: click Demo: 2 pm walk from the LRT station to the shopping mall.</w:t>
             </w:r>
           </w:p>
         </w:tc>
@@ -3036,26 +3049,26 @@
               <w:bottom w:val="single" w:color="D9CFB6" w:sz="4"/>
               <w:right w:val="single" w:color="D9CFB6" w:sz="4"/>
             </w:tcBorders>
-            <w:shd w:fill="D8E8F2" w:color="auto" w:val="clear"/>
-            <w:tcMar>
-              <w:top w:type="dxa" w:w="70"/>
-              <w:left w:type="dxa" w:w="100"/>
-              <w:bottom w:type="dxa" w:w="70"/>
-              <w:right w:type="dxa" w:w="100"/>
-            </w:tcMar>
-          </w:tcPr>
-          <w:p>
-            <w:pPr>
-              <w:spacing w:after="0"/>
-            </w:pPr>
-            <w:r>
-              <w:rPr>
-                <w:rFonts w:ascii="Calibri" w:cs="Calibri" w:eastAsia="Calibri" w:hAnsi="Calibri"/>
-                <w:b/>
-                <w:bCs/>
-                <w:color w:val="1F5E86"/>
-              </w:rPr>
-              <w:t xml:space="preserve">Steven</w:t>
+            <w:shd w:fill="F6E3C5" w:color="auto" w:val="clear"/>
+            <w:tcMar>
+              <w:top w:type="dxa" w:w="70"/>
+              <w:left w:type="dxa" w:w="100"/>
+              <w:bottom w:type="dxa" w:w="70"/>
+              <w:right w:type="dxa" w:w="100"/>
+            </w:tcMar>
+          </w:tcPr>
+          <w:p>
+            <w:pPr>
+              <w:spacing w:after="0"/>
+            </w:pPr>
+            <w:r>
+              <w:rPr>
+                <w:rFonts w:ascii="Calibri" w:cs="Calibri" w:eastAsia="Calibri" w:hAnsi="Calibri"/>
+                <w:b/>
+                <w:bCs/>
+                <w:color w:val="8A4B0F"/>
+              </w:rPr>
+              <w:t xml:space="preserve">Thien Gen</w:t>
             </w:r>
           </w:p>
         </w:tc>
@@ -3193,26 +3206,26 @@
               <w:bottom w:val="single" w:color="D9CFB6" w:sz="4"/>
               <w:right w:val="single" w:color="D9CFB6" w:sz="4"/>
             </w:tcBorders>
-            <w:shd w:fill="D8E8F2" w:color="auto" w:val="clear"/>
-            <w:tcMar>
-              <w:top w:type="dxa" w:w="70"/>
-              <w:left w:type="dxa" w:w="100"/>
-              <w:bottom w:type="dxa" w:w="70"/>
-              <w:right w:type="dxa" w:w="100"/>
-            </w:tcMar>
-          </w:tcPr>
-          <w:p>
-            <w:pPr>
-              <w:spacing w:after="0"/>
-            </w:pPr>
-            <w:r>
-              <w:rPr>
-                <w:rFonts w:ascii="Calibri" w:cs="Calibri" w:eastAsia="Calibri" w:hAnsi="Calibri"/>
-                <w:b/>
-                <w:bCs/>
-                <w:color w:val="1F5E86"/>
-              </w:rPr>
-              <w:t xml:space="preserve">Steven</w:t>
+            <w:shd w:fill="F6E3C5" w:color="auto" w:val="clear"/>
+            <w:tcMar>
+              <w:top w:type="dxa" w:w="70"/>
+              <w:left w:type="dxa" w:w="100"/>
+              <w:bottom w:type="dxa" w:w="70"/>
+              <w:right w:type="dxa" w:w="100"/>
+            </w:tcMar>
+          </w:tcPr>
+          <w:p>
+            <w:pPr>
+              <w:spacing w:after="0"/>
+            </w:pPr>
+            <w:r>
+              <w:rPr>
+                <w:rFonts w:ascii="Calibri" w:cs="Calibri" w:eastAsia="Calibri" w:hAnsi="Calibri"/>
+                <w:b/>
+                <w:bCs/>
+                <w:color w:val="8A4B0F"/>
+              </w:rPr>
+              <w:t xml:space="preserve">Thien Gen</w:t>
             </w:r>
           </w:p>
         </w:tc>
@@ -3427,7 +3440,7 @@
               <w:rPr>
                 <w:rFonts w:ascii="Calibri" w:cs="Calibri" w:eastAsia="Calibri" w:hAnsi="Calibri"/>
               </w:rPr>
-              <w:t xml:space="preserve">Steven keeps the mouse still.</w:t>
+              <w:t xml:space="preserve">Keep the mouse still on the walkway.</w:t>
             </w:r>
           </w:p>
         </w:tc>
@@ -3507,26 +3520,26 @@
               <w:bottom w:val="single" w:color="D9CFB6" w:sz="4"/>
               <w:right w:val="single" w:color="D9CFB6" w:sz="4"/>
             </w:tcBorders>
-            <w:shd w:fill="D8E8F2" w:color="auto" w:val="clear"/>
-            <w:tcMar>
-              <w:top w:type="dxa" w:w="70"/>
-              <w:left w:type="dxa" w:w="100"/>
-              <w:bottom w:type="dxa" w:w="70"/>
-              <w:right w:type="dxa" w:w="100"/>
-            </w:tcMar>
-          </w:tcPr>
-          <w:p>
-            <w:pPr>
-              <w:spacing w:after="0"/>
-            </w:pPr>
-            <w:r>
-              <w:rPr>
-                <w:rFonts w:ascii="Calibri" w:cs="Calibri" w:eastAsia="Calibri" w:hAnsi="Calibri"/>
-                <w:b/>
-                <w:bCs/>
-                <w:color w:val="1F5E86"/>
-              </w:rPr>
-              <w:t xml:space="preserve">Steven</w:t>
+            <w:shd w:fill="F6E3C5" w:color="auto" w:val="clear"/>
+            <w:tcMar>
+              <w:top w:type="dxa" w:w="70"/>
+              <w:left w:type="dxa" w:w="100"/>
+              <w:bottom w:type="dxa" w:w="70"/>
+              <w:right w:type="dxa" w:w="100"/>
+            </w:tcMar>
+          </w:tcPr>
+          <w:p>
+            <w:pPr>
+              <w:spacing w:after="0"/>
+            </w:pPr>
+            <w:r>
+              <w:rPr>
+                <w:rFonts w:ascii="Calibri" w:cs="Calibri" w:eastAsia="Calibri" w:hAnsi="Calibri"/>
+                <w:b/>
+                <w:bCs/>
+                <w:color w:val="8A4B0F"/>
+              </w:rPr>
+              <w:t xml:space="preserve">Thien Gen</w:t>
             </w:r>
           </w:p>
         </w:tc>
@@ -3821,26 +3834,26 @@
               <w:bottom w:val="single" w:color="D9CFB6" w:sz="4"/>
               <w:right w:val="single" w:color="D9CFB6" w:sz="4"/>
             </w:tcBorders>
-            <w:shd w:fill="D8E8F2" w:color="auto" w:val="clear"/>
-            <w:tcMar>
-              <w:top w:type="dxa" w:w="70"/>
-              <w:left w:type="dxa" w:w="100"/>
-              <w:bottom w:type="dxa" w:w="70"/>
-              <w:right w:type="dxa" w:w="100"/>
-            </w:tcMar>
-          </w:tcPr>
-          <w:p>
-            <w:pPr>
-              <w:spacing w:after="0"/>
-            </w:pPr>
-            <w:r>
-              <w:rPr>
-                <w:rFonts w:ascii="Calibri" w:cs="Calibri" w:eastAsia="Calibri" w:hAnsi="Calibri"/>
-                <w:b/>
-                <w:bCs/>
-                <w:color w:val="1F5E86"/>
-              </w:rPr>
-              <w:t xml:space="preserve">Steven</w:t>
+            <w:shd w:fill="F6E3C5" w:color="auto" w:val="clear"/>
+            <w:tcMar>
+              <w:top w:type="dxa" w:w="70"/>
+              <w:left w:type="dxa" w:w="100"/>
+              <w:bottom w:type="dxa" w:w="70"/>
+              <w:right w:type="dxa" w:w="100"/>
+            </w:tcMar>
+          </w:tcPr>
+          <w:p>
+            <w:pPr>
+              <w:spacing w:after="0"/>
+            </w:pPr>
+            <w:r>
+              <w:rPr>
+                <w:rFonts w:ascii="Calibri" w:cs="Calibri" w:eastAsia="Calibri" w:hAnsi="Calibri"/>
+                <w:b/>
+                <w:bCs/>
+                <w:color w:val="8A4B0F"/>
+              </w:rPr>
+              <w:t xml:space="preserve">Thien Gen</w:t>
             </w:r>
           </w:p>
         </w:tc>
@@ -3978,26 +3991,26 @@
               <w:bottom w:val="single" w:color="D9CFB6" w:sz="4"/>
               <w:right w:val="single" w:color="D9CFB6" w:sz="4"/>
             </w:tcBorders>
-            <w:shd w:fill="D8E8F2" w:color="auto" w:val="clear"/>
-            <w:tcMar>
-              <w:top w:type="dxa" w:w="70"/>
-              <w:left w:type="dxa" w:w="100"/>
-              <w:bottom w:type="dxa" w:w="70"/>
-              <w:right w:type="dxa" w:w="100"/>
-            </w:tcMar>
-          </w:tcPr>
-          <w:p>
-            <w:pPr>
-              <w:spacing w:after="0"/>
-            </w:pPr>
-            <w:r>
-              <w:rPr>
-                <w:rFonts w:ascii="Calibri" w:cs="Calibri" w:eastAsia="Calibri" w:hAnsi="Calibri"/>
-                <w:b/>
-                <w:bCs/>
-                <w:color w:val="1F5E86"/>
-              </w:rPr>
-              <w:t xml:space="preserve">Steven</w:t>
+            <w:shd w:fill="F6E3C5" w:color="auto" w:val="clear"/>
+            <w:tcMar>
+              <w:top w:type="dxa" w:w="70"/>
+              <w:left w:type="dxa" w:w="100"/>
+              <w:bottom w:type="dxa" w:w="70"/>
+              <w:right w:type="dxa" w:w="100"/>
+            </w:tcMar>
+          </w:tcPr>
+          <w:p>
+            <w:pPr>
+              <w:spacing w:after="0"/>
+            </w:pPr>
+            <w:r>
+              <w:rPr>
+                <w:rFonts w:ascii="Calibri" w:cs="Calibri" w:eastAsia="Calibri" w:hAnsi="Calibri"/>
+                <w:b/>
+                <w:bCs/>
+                <w:color w:val="8A4B0F"/>
+              </w:rPr>
+              <w:t xml:space="preserve">Thien Gen</w:t>
             </w:r>
           </w:p>
         </w:tc>
@@ -4292,26 +4305,26 @@
               <w:bottom w:val="single" w:color="D9CFB6" w:sz="4"/>
               <w:right w:val="single" w:color="D9CFB6" w:sz="4"/>
             </w:tcBorders>
-            <w:shd w:fill="D8E8F2" w:color="auto" w:val="clear"/>
-            <w:tcMar>
-              <w:top w:type="dxa" w:w="70"/>
-              <w:left w:type="dxa" w:w="100"/>
-              <w:bottom w:type="dxa" w:w="70"/>
-              <w:right w:type="dxa" w:w="100"/>
-            </w:tcMar>
-          </w:tcPr>
-          <w:p>
-            <w:pPr>
-              <w:spacing w:after="0"/>
-            </w:pPr>
-            <w:r>
-              <w:rPr>
-                <w:rFonts w:ascii="Calibri" w:cs="Calibri" w:eastAsia="Calibri" w:hAnsi="Calibri"/>
-                <w:b/>
-                <w:bCs/>
-                <w:color w:val="1F5E86"/>
-              </w:rPr>
-              <w:t xml:space="preserve">Steven</w:t>
+            <w:shd w:fill="F6E3C5" w:color="auto" w:val="clear"/>
+            <w:tcMar>
+              <w:top w:type="dxa" w:w="70"/>
+              <w:left w:type="dxa" w:w="100"/>
+              <w:bottom w:type="dxa" w:w="70"/>
+              <w:right w:type="dxa" w:w="100"/>
+            </w:tcMar>
+          </w:tcPr>
+          <w:p>
+            <w:pPr>
+              <w:spacing w:after="0"/>
+            </w:pPr>
+            <w:r>
+              <w:rPr>
+                <w:rFonts w:ascii="Calibri" w:cs="Calibri" w:eastAsia="Calibri" w:hAnsi="Calibri"/>
+                <w:b/>
+                <w:bCs/>
+                <w:color w:val="8A4B0F"/>
+              </w:rPr>
+              <w:t xml:space="preserve">Thien Gen</w:t>
             </w:r>
           </w:p>
         </w:tc>
@@ -4341,7 +4354,7 @@
                 <w:i/>
                 <w:iCs/>
               </w:rPr>
-              <w:t xml:space="preserve">“I’ll check it against the photo, adjust, and confirm.”</w:t>
+              <w:t xml:space="preserve">“I’ll check it against the photo, adjust, and confirm. Back to Steven.”</w:t>
             </w:r>
           </w:p>
         </w:tc>
@@ -4369,7 +4382,7 @@
               <w:rPr>
                 <w:rFonts w:ascii="Calibri" w:cs="Calibri" w:eastAsia="Calibri" w:hAnsi="Calibri"/>
               </w:rPr>
-              <w:t xml:space="preserve">Drag Your value if needed, then Confirm and apply to map.</w:t>
+              <w:t xml:space="preserve">Drag Your value if needed, then Confirm and apply to map. Alt+Tab back to the deck and hand the keyboard back.</w:t>
             </w:r>
           </w:p>
         </w:tc>
@@ -4526,7 +4539,7 @@
               <w:rPr>
                 <w:rFonts w:ascii="Calibri" w:cs="Calibri" w:eastAsia="Calibri" w:hAnsi="Calibri"/>
               </w:rPr>
-              <w:t xml:space="preserve">Alt+Tab to the deck: How it works.</w:t>
+              <w:t xml:space="preserve">Next slide: How it works.</w:t>
             </w:r>
           </w:p>
         </w:tc>
@@ -4606,26 +4619,26 @@
               <w:bottom w:val="single" w:color="D9CFB6" w:sz="4"/>
               <w:right w:val="single" w:color="D9CFB6" w:sz="4"/>
             </w:tcBorders>
-            <w:shd w:fill="F6E3C5" w:color="auto" w:val="clear"/>
-            <w:tcMar>
-              <w:top w:type="dxa" w:w="70"/>
-              <w:left w:type="dxa" w:w="100"/>
-              <w:bottom w:type="dxa" w:w="70"/>
-              <w:right w:type="dxa" w:w="100"/>
-            </w:tcMar>
-          </w:tcPr>
-          <w:p>
-            <w:pPr>
-              <w:spacing w:after="0"/>
-            </w:pPr>
-            <w:r>
-              <w:rPr>
-                <w:rFonts w:ascii="Calibri" w:cs="Calibri" w:eastAsia="Calibri" w:hAnsi="Calibri"/>
-                <w:b/>
-                <w:bCs/>
-                <w:color w:val="8A4B0F"/>
-              </w:rPr>
-              <w:t xml:space="preserve">Thien Gen</w:t>
+            <w:shd w:fill="D8E8F2" w:color="auto" w:val="clear"/>
+            <w:tcMar>
+              <w:top w:type="dxa" w:w="70"/>
+              <w:left w:type="dxa" w:w="100"/>
+              <w:bottom w:type="dxa" w:w="70"/>
+              <w:right w:type="dxa" w:w="100"/>
+            </w:tcMar>
+          </w:tcPr>
+          <w:p>
+            <w:pPr>
+              <w:spacing w:after="0"/>
+            </w:pPr>
+            <w:r>
+              <w:rPr>
+                <w:rFonts w:ascii="Calibri" w:cs="Calibri" w:eastAsia="Calibri" w:hAnsi="Calibri"/>
+                <w:b/>
+                <w:bCs/>
+                <w:color w:val="1F5E86"/>
+              </w:rPr>
+              <w:t xml:space="preserve">Steven</w:t>
             </w:r>
           </w:p>
         </w:tc>
@@ -4763,26 +4776,26 @@
               <w:bottom w:val="single" w:color="D9CFB6" w:sz="4"/>
               <w:right w:val="single" w:color="D9CFB6" w:sz="4"/>
             </w:tcBorders>
-            <w:shd w:fill="F6E3C5" w:color="auto" w:val="clear"/>
-            <w:tcMar>
-              <w:top w:type="dxa" w:w="70"/>
-              <w:left w:type="dxa" w:w="100"/>
-              <w:bottom w:type="dxa" w:w="70"/>
-              <w:right w:type="dxa" w:w="100"/>
-            </w:tcMar>
-          </w:tcPr>
-          <w:p>
-            <w:pPr>
-              <w:spacing w:after="0"/>
-            </w:pPr>
-            <w:r>
-              <w:rPr>
-                <w:rFonts w:ascii="Calibri" w:cs="Calibri" w:eastAsia="Calibri" w:hAnsi="Calibri"/>
-                <w:b/>
-                <w:bCs/>
-                <w:color w:val="8A4B0F"/>
-              </w:rPr>
-              <w:t xml:space="preserve">Thien Gen</w:t>
+            <w:shd w:fill="D8E8F2" w:color="auto" w:val="clear"/>
+            <w:tcMar>
+              <w:top w:type="dxa" w:w="70"/>
+              <w:left w:type="dxa" w:w="100"/>
+              <w:bottom w:type="dxa" w:w="70"/>
+              <w:right w:type="dxa" w:w="100"/>
+            </w:tcMar>
+          </w:tcPr>
+          <w:p>
+            <w:pPr>
+              <w:spacing w:after="0"/>
+            </w:pPr>
+            <w:r>
+              <w:rPr>
+                <w:rFonts w:ascii="Calibri" w:cs="Calibri" w:eastAsia="Calibri" w:hAnsi="Calibri"/>
+                <w:b/>
+                <w:bCs/>
+                <w:color w:val="1F5E86"/>
+              </w:rPr>
+              <w:t xml:space="preserve">Steven</w:t>
             </w:r>
           </w:p>
         </w:tc>
@@ -4969,7 +4982,7 @@
                 <w:i/>
                 <w:iCs/>
               </w:rPr>
-              <w:t xml:space="preserve">“It already runs on 15 Klang Valley areas and any other place in about 40 seconds: this is SDP’s Ara Damansara.”</w:t>
+              <w:t xml:space="preserve">“It already runs on 15 Klang Valley areas and any other place in about 40 seconds: this is SDP’s own Ara Damansara.”</w:t>
             </w:r>
           </w:p>
         </w:tc>
@@ -5077,26 +5090,26 @@
               <w:bottom w:val="single" w:color="D9CFB6" w:sz="4"/>
               <w:right w:val="single" w:color="D9CFB6" w:sz="4"/>
             </w:tcBorders>
-            <w:shd w:fill="F6E3C5" w:color="auto" w:val="clear"/>
-            <w:tcMar>
-              <w:top w:type="dxa" w:w="70"/>
-              <w:left w:type="dxa" w:w="100"/>
-              <w:bottom w:type="dxa" w:w="70"/>
-              <w:right w:type="dxa" w:w="100"/>
-            </w:tcMar>
-          </w:tcPr>
-          <w:p>
-            <w:pPr>
-              <w:spacing w:after="0"/>
-            </w:pPr>
-            <w:r>
-              <w:rPr>
-                <w:rFonts w:ascii="Calibri" w:cs="Calibri" w:eastAsia="Calibri" w:hAnsi="Calibri"/>
-                <w:b/>
-                <w:bCs/>
-                <w:color w:val="8A4B0F"/>
-              </w:rPr>
-              <w:t xml:space="preserve">Thien Gen</w:t>
+            <w:shd w:fill="D8E8F2" w:color="auto" w:val="clear"/>
+            <w:tcMar>
+              <w:top w:type="dxa" w:w="70"/>
+              <w:left w:type="dxa" w:w="100"/>
+              <w:bottom w:type="dxa" w:w="70"/>
+              <w:right w:type="dxa" w:w="100"/>
+            </w:tcMar>
+          </w:tcPr>
+          <w:p>
+            <w:pPr>
+              <w:spacing w:after="0"/>
+            </w:pPr>
+            <w:r>
+              <w:rPr>
+                <w:rFonts w:ascii="Calibri" w:cs="Calibri" w:eastAsia="Calibri" w:hAnsi="Calibri"/>
+                <w:b/>
+                <w:bCs/>
+                <w:color w:val="1F5E86"/>
+              </w:rPr>
+              <w:t xml:space="preserve">Steven</w:t>
             </w:r>
           </w:p>
         </w:tc>
@@ -5249,7 +5262,7 @@
         <w:pStyle w:val="Heading1"/>
       </w:pPr>
       <w:r>
-        <w:t xml:space="preserve">Cue cards: each presenter’s lines only</w:t>
+        <w:t xml:space="preserve">Cue cards: each person’s lines only</w:t>
       </w:r>
     </w:p>
     <w:p>
@@ -5257,7 +5270,7 @@
         <w:pStyle w:val="Heading2"/>
       </w:pPr>
       <w:r>
-        <w:t xml:space="preserve">Thien Gen’s lines</w:t>
+        <w:t xml:space="preserve">Steven (presenter): all the slides</w:t>
       </w:r>
     </w:p>
     <w:tbl>
@@ -5411,7 +5424,7 @@
                 <w:i/>
                 <w:iCs/>
               </w:rPr>
-              <w:t xml:space="preserve">“Hi, we are [team name]. I’m Thien Gen, this is Steven. Teduh is Malay for shaded or sheltered. Our track is Planet, focus climate resilience.”</w:t>
+              <w:t xml:space="preserve">“Hi, we are Team One. I’m Steven, this is Thien Gen. Teduh is Malay for shaded or sheltered. Our track is Planet, focus climate resilience.”</w:t>
             </w:r>
             <w:r>
               <w:rPr>
@@ -5606,7 +5619,7 @@
                 <w:bCs/>
                 <w:color w:val="96590A"/>
               </w:rPr>
-              <w:t xml:space="preserve">2:20</w:t>
+              <w:t xml:space="preserve">1:10</w:t>
             </w:r>
           </w:p>
         </w:tc>
@@ -5636,7 +5649,7 @@
                 <w:i/>
                 <w:iCs/>
               </w:rPr>
-              <w:t xml:space="preserve">“That’s the key idea: one walkway on a shared stretch helps the mall, the college and the clinic walks at once.”</w:t>
+              <w:t xml:space="preserve">“Teduh answers one question: with this budget, which shade helps the most walks? It recommends trees and covered walkways, shows before and after, and hands off a build pack. Thien Gen will show you on a real township.”</w:t>
             </w:r>
             <w:r>
               <w:rPr>
@@ -5645,7 +5658,7 @@
                 <w:sz w:val="19"/>
                 <w:szCs w:val="19"/>
               </w:rPr>
-              <w:t xml:space="preserve">  →  Steven keeps the mouse still.</w:t>
+              <w:t xml:space="preserve">  →  Next slide: Solution, then the Live demo slide. Move aside; Thien Gen takes the keyboard.</w:t>
             </w:r>
           </w:p>
         </w:tc>
@@ -5681,7 +5694,7 @@
                 <w:bCs/>
                 <w:color w:val="96590A"/>
               </w:rPr>
-              <w:t xml:space="preserve">2:50</w:t>
+              <w:t xml:space="preserve">3:45</w:t>
             </w:r>
           </w:p>
         </w:tc>
@@ -5711,7 +5724,16 @@
                 <w:i/>
                 <w:iCs/>
               </w:rPr>
-              <w:t xml:space="preserve">“Twice the benefit for about half the money, if you can wait, and if the trees grow as modelled.”</w:t>
+              <w:t xml:space="preserve">“Under the hood: open map data, the real sun position, real station counts, and a score anyone can inspect: hours walked in direct sun, avoided.”</w:t>
+            </w:r>
+            <w:r>
+              <w:rPr>
+                <w:rFonts w:ascii="Calibri" w:cs="Calibri" w:eastAsia="Calibri" w:hAnsi="Calibri"/>
+                <w:color w:val="46554C"/>
+                <w:sz w:val="19"/>
+                <w:szCs w:val="19"/>
+              </w:rPr>
+              <w:t xml:space="preserve">  →  Next slide: How it works.</w:t>
             </w:r>
           </w:p>
         </w:tc>
@@ -5747,7 +5769,7 @@
                 <w:bCs/>
                 <w:color w:val="96590A"/>
               </w:rPr>
-              <w:t xml:space="preserve">3:25</w:t>
+              <w:t xml:space="preserve">4:05</w:t>
             </w:r>
           </w:p>
         </w:tc>
@@ -5774,10 +5796,19 @@
             <w:r>
               <w:rPr>
                 <w:rFonts w:ascii="Calibri" w:cs="Calibri" w:eastAsia="Calibri" w:hAnsi="Calibri"/>
-                <w:i w:val="false"/>
-                <w:iCs w:val="false"/>
-              </w:rPr>
-              <w:t xml:space="preserve">Talk over the wait: “Photos stay on this laptop, and there’s no cloud cost per photo.”</w:t>
+                <w:i/>
+                <w:iCs/>
+              </w:rPr>
+              <w:t xml:space="preserve">“In this scenario, RM 94,000 takes 12.7 pedestrian-hours a day out of direct sun. These are model estimates; a pilot measures the real effect.”</w:t>
+            </w:r>
+            <w:r>
+              <w:rPr>
+                <w:rFonts w:ascii="Calibri" w:cs="Calibri" w:eastAsia="Calibri" w:hAnsi="Calibri"/>
+                <w:color w:val="46554C"/>
+                <w:sz w:val="19"/>
+                <w:szCs w:val="19"/>
+              </w:rPr>
+              <w:t xml:space="preserve">  →  Next slide: Impact.</w:t>
             </w:r>
           </w:p>
         </w:tc>
@@ -5813,7 +5844,7 @@
                 <w:bCs/>
                 <w:color w:val="96590A"/>
               </w:rPr>
-              <w:t xml:space="preserve">4:05</w:t>
+              <w:t xml:space="preserve">4:20</w:t>
             </w:r>
           </w:p>
         </w:tc>
@@ -5843,7 +5874,7 @@
                 <w:i/>
                 <w:iCs/>
               </w:rPr>
-              <w:t xml:space="preserve">“In this scenario, RM 94,000 takes 12.7 pedestrian-hours a day out of direct sun. These are model estimates; a pilot measures the real effect.”</w:t>
+              <w:t xml:space="preserve">“Routing apps like Singapore’s Undercover help a walker. Teduh helps a township decide what to build.”</w:t>
             </w:r>
             <w:r>
               <w:rPr>
@@ -5852,7 +5883,7 @@
                 <w:sz w:val="19"/>
                 <w:szCs w:val="19"/>
               </w:rPr>
-              <w:t xml:space="preserve">  →  Next slide: Impact.</w:t>
+              <w:t xml:space="preserve">  →  Next slide: Innovation.</w:t>
             </w:r>
           </w:p>
         </w:tc>
@@ -5888,7 +5919,7 @@
                 <w:bCs/>
                 <w:color w:val="96590A"/>
               </w:rPr>
-              <w:t xml:space="preserve">4:20</w:t>
+              <w:t xml:space="preserve">4:30</w:t>
             </w:r>
           </w:p>
         </w:tc>
@@ -5918,7 +5949,7 @@
                 <w:i/>
                 <w:iCs/>
               </w:rPr>
-              <w:t xml:space="preserve">“Routing apps like Singapore’s Undercover help a walker. Teduh helps a township decide what to build.”</w:t>
+              <w:t xml:space="preserve">“It already runs on 15 Klang Valley areas and any other place in about 40 seconds: this is SDP’s own Ara Damansara.”</w:t>
             </w:r>
             <w:r>
               <w:rPr>
@@ -5927,7 +5958,7 @@
                 <w:sz w:val="19"/>
                 <w:szCs w:val="19"/>
               </w:rPr>
-              <w:t xml:space="preserve">  →  Next slide: Innovation.</w:t>
+              <w:t xml:space="preserve">  →  Next slide: Feasibility.</w:t>
             </w:r>
           </w:p>
         </w:tc>
@@ -6018,7 +6049,7 @@
         <w:pStyle w:val="Heading2"/>
       </w:pPr>
       <w:r>
-        <w:t xml:space="preserve">Steven’s lines</w:t>
+        <w:t xml:space="preserve">Thien Gen (demo): the live demo, 1:30 to 3:45</w:t>
       </w:r>
     </w:p>
     <w:tbl>
@@ -6142,7 +6173,7 @@
                 <w:bCs/>
                 <w:color w:val="96590A"/>
               </w:rPr>
-              <w:t xml:space="preserve">1:10</w:t>
+              <w:t xml:space="preserve">1:30</w:t>
             </w:r>
           </w:p>
         </w:tc>
@@ -6172,7 +6203,7 @@
                 <w:i/>
                 <w:iCs/>
               </w:rPr>
-              <w:t xml:space="preserve">“Teduh answers one question: with this budget, which shade helps the most walks? It recommends trees and covered walkways, shows before and after, and hands off a build pack. Let me show you.”</w:t>
+              <w:t xml:space="preserve">“Thanks, Steven. This is the real SS 15. Streets and buildings are from OpenStreetMap. Here is the 2 pm walk from the LRT station to the mall.”</w:t>
             </w:r>
             <w:r>
               <w:rPr>
@@ -6181,7 +6212,7 @@
                 <w:sz w:val="19"/>
                 <w:szCs w:val="19"/>
               </w:rPr>
-              <w:t xml:space="preserve">  →  Next slide: Solution, then the Live demo slide. Alt+Tab to the app.</w:t>
+              <w:t xml:space="preserve">  →  Alt+Tab to the app. Left panel: click Demo: 2 pm walk from the LRT station to the shopping mall.</w:t>
             </w:r>
           </w:p>
         </w:tc>
@@ -6217,7 +6248,7 @@
                 <w:bCs/>
                 <w:color w:val="96590A"/>
               </w:rPr>
-              <w:t xml:space="preserve">1:30</w:t>
+              <w:t xml:space="preserve">1:45</w:t>
             </w:r>
           </w:p>
         </w:tc>
@@ -6247,7 +6278,7 @@
                 <w:i/>
                 <w:iCs/>
               </w:rPr>
-              <w:t xml:space="preserve">“This is the real SS 15. Streets and buildings are from OpenStreetMap. Here is the 2 pm walk from the LRT station to the mall.”</w:t>
+              <w:t xml:space="preserve">“With RM 100,000, Teduh tried every affordable combination and recommends one covered walkway and two tree rows, for RM 94,100. The walkway from the station on Jengka Avenue does most of the work.”</w:t>
             </w:r>
             <w:r>
               <w:rPr>
@@ -6256,7 +6287,7 @@
                 <w:sz w:val="19"/>
                 <w:szCs w:val="19"/>
               </w:rPr>
-              <w:t xml:space="preserve">  →  Left panel: click Demo: 2 pm walk from the LRT station to the shopping mall.</w:t>
+              <w:t xml:space="preserve">  →  Top bar: 2 Plan builder. Point at the Best card, then scroll to What each one adds.</w:t>
             </w:r>
           </w:p>
         </w:tc>
@@ -6292,7 +6323,7 @@
                 <w:bCs/>
                 <w:color w:val="96590A"/>
               </w:rPr>
-              <w:t xml:space="preserve">1:45</w:t>
+              <w:t xml:space="preserve">2:05</w:t>
             </w:r>
           </w:p>
         </w:tc>
@@ -6322,7 +6353,7 @@
                 <w:i/>
                 <w:iCs/>
               </w:rPr>
-              <w:t xml:space="preserve">“With RM 100,000, Teduh tried every affordable combination and recommends one covered walkway and two tree rows, for RM 94,100. The walkway from the station on Jengka Avenue does most of the work.”</w:t>
+              <w:t xml:space="preserve">“Before on the left, after on the right.”</w:t>
             </w:r>
             <w:r>
               <w:rPr>
@@ -6331,7 +6362,7 @@
                 <w:sz w:val="19"/>
                 <w:szCs w:val="19"/>
               </w:rPr>
-              <w:t xml:space="preserve">  →  Top bar: 2 Plan builder. Point at the Best card, then scroll to What each one adds.</w:t>
+              <w:t xml:space="preserve">  →  On the map, drag the round ⇄ handle from the middle to the left, slowly, past the LRT station marker.</w:t>
             </w:r>
           </w:p>
         </w:tc>
@@ -6367,7 +6398,7 @@
                 <w:bCs/>
                 <w:color w:val="96590A"/>
               </w:rPr>
-              <w:t xml:space="preserve">2:05</w:t>
+              <w:t xml:space="preserve">2:20</w:t>
             </w:r>
           </w:p>
         </w:tc>
@@ -6397,7 +6428,7 @@
                 <w:i/>
                 <w:iCs/>
               </w:rPr>
-              <w:t xml:space="preserve">“Before on the left, after on the right.”</w:t>
+              <w:t xml:space="preserve">“That’s the key idea: one walkway on a shared stretch helps the mall, the college and the clinic walks at once.”</w:t>
             </w:r>
             <w:r>
               <w:rPr>
@@ -6406,7 +6437,7 @@
                 <w:sz w:val="19"/>
                 <w:szCs w:val="19"/>
               </w:rPr>
-              <w:t xml:space="preserve">  →  On the map, drag the round ⇄ handle from the middle to the left, slowly, past the LRT station marker.</w:t>
+              <w:t xml:space="preserve">  →  Keep the mouse still on the walkway.</w:t>
             </w:r>
           </w:p>
         </w:tc>
@@ -6517,7 +6548,7 @@
                 <w:bCs/>
                 <w:color w:val="96590A"/>
               </w:rPr>
-              <w:t xml:space="preserve">2:55</w:t>
+              <w:t xml:space="preserve">2:50</w:t>
             </w:r>
           </w:p>
         </w:tc>
@@ -6547,16 +6578,7 @@
                 <w:i/>
                 <w:iCs/>
               </w:rPr>
-              <w:t xml:space="preserve">“Every item comes with a spec pack a contractor can quote from.”</w:t>
-            </w:r>
-            <w:r>
-              <w:rPr>
-                <w:rFonts w:ascii="Calibri" w:cs="Calibri" w:eastAsia="Calibri" w:hAnsi="Calibri"/>
-                <w:color w:val="46554C"/>
-                <w:sz w:val="19"/>
-                <w:szCs w:val="19"/>
-              </w:rPr>
-              <w:t xml:space="preserve">  →  Click Now. Left panel, under Candidates: Details next to Covered walkway from the LRT station on Jengka Avenue (69 m).</w:t>
+              <w:t xml:space="preserve">“Twice the benefit for about half the money, if you can wait, and if the trees grow as modelled.”</w:t>
             </w:r>
           </w:p>
         </w:tc>
@@ -6592,7 +6614,7 @@
                 <w:bCs/>
                 <w:color w:val="96590A"/>
               </w:rPr>
-              <w:t xml:space="preserve">3:15</w:t>
+              <w:t xml:space="preserve">2:55</w:t>
             </w:r>
           </w:p>
         </w:tc>
@@ -6622,7 +6644,7 @@
                 <w:i/>
                 <w:iCs/>
               </w:rPr>
-              <w:t xml:space="preserve">“OpenStreetMap has almost no trees mapped here, so our shade is a model. A survey photo fills that gap. A vision model running on this laptop estimates the shade, and nothing reaches the map until a person confirms it.”</w:t>
+              <w:t xml:space="preserve">“Every item comes with a spec pack a contractor can quote from.”</w:t>
             </w:r>
             <w:r>
               <w:rPr>
@@ -6631,7 +6653,7 @@
                 <w:sz w:val="19"/>
                 <w:szCs w:val="19"/>
               </w:rPr>
-              <w:t xml:space="preserve">  →  4 AI scan. Path segment already reads Jengka Avenue (Main road) · seg-116. Choose File → photo → Estimate shade.</w:t>
+              <w:t xml:space="preserve">  →  Click Now. Left panel, under Candidates: Details next to Covered walkway from the LRT station on Jengka Avenue (69 m).</w:t>
             </w:r>
           </w:p>
         </w:tc>
@@ -6667,7 +6689,7 @@
                 <w:bCs/>
                 <w:color w:val="96590A"/>
               </w:rPr>
-              <w:t xml:space="preserve">3:35</w:t>
+              <w:t xml:space="preserve">3:15</w:t>
             </w:r>
           </w:p>
         </w:tc>
@@ -6697,7 +6719,7 @@
                 <w:i/>
                 <w:iCs/>
               </w:rPr>
-              <w:t xml:space="preserve">“I’ll check it against the photo, adjust, and confirm.”</w:t>
+              <w:t xml:space="preserve">“OpenStreetMap has almost no trees mapped here, so our shade is a model. A survey photo fills that gap. A vision model running on this laptop estimates the shade, and nothing reaches the map until a person confirms it.”</w:t>
             </w:r>
             <w:r>
               <w:rPr>
@@ -6706,7 +6728,7 @@
                 <w:sz w:val="19"/>
                 <w:szCs w:val="19"/>
               </w:rPr>
-              <w:t xml:space="preserve">  →  Drag Your value if needed, then Confirm and apply to map.</w:t>
+              <w:t xml:space="preserve">  →  4 AI scan. Path segment already reads Jengka Avenue (Main road) · seg-116. Choose File → photo → Estimate shade.</w:t>
             </w:r>
           </w:p>
         </w:tc>
@@ -6742,7 +6764,7 @@
                 <w:bCs/>
                 <w:color w:val="96590A"/>
               </w:rPr>
-              <w:t xml:space="preserve">3:45</w:t>
+              <w:t xml:space="preserve">3:25</w:t>
             </w:r>
           </w:p>
         </w:tc>
@@ -6769,19 +6791,10 @@
             <w:r>
               <w:rPr>
                 <w:rFonts w:ascii="Calibri" w:cs="Calibri" w:eastAsia="Calibri" w:hAnsi="Calibri"/>
-                <w:i/>
-                <w:iCs/>
-              </w:rPr>
-              <w:t xml:space="preserve">“Under the hood: open map data, the real sun position, real station counts, and a score anyone can inspect: hours walked in direct sun, avoided.”</w:t>
-            </w:r>
-            <w:r>
-              <w:rPr>
-                <w:rFonts w:ascii="Calibri" w:cs="Calibri" w:eastAsia="Calibri" w:hAnsi="Calibri"/>
-                <w:color w:val="46554C"/>
-                <w:sz w:val="19"/>
-                <w:szCs w:val="19"/>
-              </w:rPr>
-              <w:t xml:space="preserve">  →  Alt+Tab to the deck: How it works.</w:t>
+                <w:i w:val="false"/>
+                <w:iCs w:val="false"/>
+              </w:rPr>
+              <w:t xml:space="preserve">Talk over the wait: “Photos stay on this laptop, and there’s no cloud cost per photo.”</w:t>
             </w:r>
           </w:p>
         </w:tc>
@@ -6817,7 +6830,7 @@
                 <w:bCs/>
                 <w:color w:val="96590A"/>
               </w:rPr>
-              <w:t xml:space="preserve">4:30</w:t>
+              <w:t xml:space="preserve">3:35</w:t>
             </w:r>
           </w:p>
         </w:tc>
@@ -6847,7 +6860,7 @@
                 <w:i/>
                 <w:iCs/>
               </w:rPr>
-              <w:t xml:space="preserve">“It already runs on 15 Klang Valley areas and any other place in about 40 seconds: this is SDP’s Ara Damansara.”</w:t>
+              <w:t xml:space="preserve">“I’ll check it against the photo, adjust, and confirm. Back to Steven.”</w:t>
             </w:r>
             <w:r>
               <w:rPr>
@@ -6856,7 +6869,7 @@
                 <w:sz w:val="19"/>
                 <w:szCs w:val="19"/>
               </w:rPr>
-              <w:t xml:space="preserve">  →  Next slide: Feasibility.</w:t>
+              <w:t xml:space="preserve">  →  Drag Your value if needed, then Confirm and apply to map. Alt+Tab back to the deck and hand the keyboard back.</w:t>
             </w:r>
           </w:p>
         </w:tc>
@@ -7588,7 +7601,7 @@
         <w:rPr>
           <w:rFonts w:ascii="Calibri" w:cs="Calibri" w:eastAsia="Calibri" w:hAnsi="Calibri"/>
         </w:rPr>
-        <w:t xml:space="preserve">Same opening and close as Part A. Slow the demo down and add these after the AI scan step. Do the Ara Damansara lookup once the evening before in the same browser: it is saved there, so on the day you can pick it from the Area dropdown if the Wi-Fi is slow.</w:t>
+        <w:t xml:space="preserve">Same split: Steven presents, Thien Gen demos. Same opening as Part A; Thien Gen’s demo runs longer, adding these after the AI scan step (at 3:35 Thien Gen carries on instead of handing back), and Steven takes back at 7:30. Do the Ara Damansara lookup once the evening before in the same browser: it is saved there, so on the day you can pick it from the Area dropdown if the Wi-Fi is slow.</w:t>
       </w:r>
     </w:p>
     <w:tbl>
@@ -7795,26 +7808,26 @@
               <w:bottom w:val="single" w:color="D9CFB6" w:sz="4"/>
               <w:right w:val="single" w:color="D9CFB6" w:sz="4"/>
             </w:tcBorders>
-            <w:shd w:fill="D8E8F2" w:color="auto" w:val="clear"/>
-            <w:tcMar>
-              <w:top w:type="dxa" w:w="70"/>
-              <w:left w:type="dxa" w:w="100"/>
-              <w:bottom w:type="dxa" w:w="70"/>
-              <w:right w:type="dxa" w:w="100"/>
-            </w:tcMar>
-          </w:tcPr>
-          <w:p>
-            <w:pPr>
-              <w:spacing w:after="0"/>
-            </w:pPr>
-            <w:r>
-              <w:rPr>
-                <w:rFonts w:ascii="Calibri" w:cs="Calibri" w:eastAsia="Calibri" w:hAnsi="Calibri"/>
-                <w:b/>
-                <w:bCs/>
-                <w:color w:val="1F5E86"/>
-              </w:rPr>
-              <w:t xml:space="preserve">Steven</w:t>
+            <w:shd w:fill="F6E3C5" w:color="auto" w:val="clear"/>
+            <w:tcMar>
+              <w:top w:type="dxa" w:w="70"/>
+              <w:left w:type="dxa" w:w="100"/>
+              <w:bottom w:type="dxa" w:w="70"/>
+              <w:right w:type="dxa" w:w="100"/>
+            </w:tcMar>
+          </w:tcPr>
+          <w:p>
+            <w:pPr>
+              <w:spacing w:after="0"/>
+            </w:pPr>
+            <w:r>
+              <w:rPr>
+                <w:rFonts w:ascii="Calibri" w:cs="Calibri" w:eastAsia="Calibri" w:hAnsi="Calibri"/>
+                <w:b/>
+                <w:bCs/>
+                <w:color w:val="8A4B0F"/>
+              </w:rPr>
+              <w:t xml:space="preserve">Thien Gen</w:t>
             </w:r>
           </w:p>
         </w:tc>
@@ -7921,26 +7934,26 @@
               <w:bottom w:val="single" w:color="D9CFB6" w:sz="4"/>
               <w:right w:val="single" w:color="D9CFB6" w:sz="4"/>
             </w:tcBorders>
-            <w:shd w:fill="D8E8F2" w:color="auto" w:val="clear"/>
-            <w:tcMar>
-              <w:top w:type="dxa" w:w="70"/>
-              <w:left w:type="dxa" w:w="100"/>
-              <w:bottom w:type="dxa" w:w="70"/>
-              <w:right w:type="dxa" w:w="100"/>
-            </w:tcMar>
-          </w:tcPr>
-          <w:p>
-            <w:pPr>
-              <w:spacing w:after="0"/>
-            </w:pPr>
-            <w:r>
-              <w:rPr>
-                <w:rFonts w:ascii="Calibri" w:cs="Calibri" w:eastAsia="Calibri" w:hAnsi="Calibri"/>
-                <w:b/>
-                <w:bCs/>
-                <w:color w:val="1F5E86"/>
-              </w:rPr>
-              <w:t xml:space="preserve">Steven</w:t>
+            <w:shd w:fill="F6E3C5" w:color="auto" w:val="clear"/>
+            <w:tcMar>
+              <w:top w:type="dxa" w:w="70"/>
+              <w:left w:type="dxa" w:w="100"/>
+              <w:bottom w:type="dxa" w:w="70"/>
+              <w:right w:type="dxa" w:w="100"/>
+            </w:tcMar>
+          </w:tcPr>
+          <w:p>
+            <w:pPr>
+              <w:spacing w:after="0"/>
+            </w:pPr>
+            <w:r>
+              <w:rPr>
+                <w:rFonts w:ascii="Calibri" w:cs="Calibri" w:eastAsia="Calibri" w:hAnsi="Calibri"/>
+                <w:b/>
+                <w:bCs/>
+                <w:color w:val="8A4B0F"/>
+              </w:rPr>
+              <w:t xml:space="preserve">Thien Gen</w:t>
             </w:r>
           </w:p>
         </w:tc>
@@ -8124,7 +8137,7 @@
               <w:rPr>
                 <w:rFonts w:ascii="Calibri" w:cs="Calibri" w:eastAsia="Calibri" w:hAnsi="Calibri"/>
               </w:rPr>
-              <w:t xml:space="preserve">Steven: 4 AI scan → Explain this plan (about 20 s). A TEMPLATE badge means the model’s text was rejected for inventing a figure; say so, it is a safeguard.</w:t>
+              <w:t xml:space="preserve">4 AI scan → Explain this plan (about 20 s). A TEMPLATE badge means the model’s text was rejected for inventing a figure; say so, it is a safeguard.</w:t>
             </w:r>
           </w:p>
         </w:tc>
@@ -8173,26 +8186,26 @@
               <w:bottom w:val="single" w:color="D9CFB6" w:sz="4"/>
               <w:right w:val="single" w:color="D9CFB6" w:sz="4"/>
             </w:tcBorders>
-            <w:shd w:fill="D8E8F2" w:color="auto" w:val="clear"/>
-            <w:tcMar>
-              <w:top w:type="dxa" w:w="70"/>
-              <w:left w:type="dxa" w:w="100"/>
-              <w:bottom w:type="dxa" w:w="70"/>
-              <w:right w:type="dxa" w:w="100"/>
-            </w:tcMar>
-          </w:tcPr>
-          <w:p>
-            <w:pPr>
-              <w:spacing w:after="0"/>
-            </w:pPr>
-            <w:r>
-              <w:rPr>
-                <w:rFonts w:ascii="Calibri" w:cs="Calibri" w:eastAsia="Calibri" w:hAnsi="Calibri"/>
-                <w:b/>
-                <w:bCs/>
-                <w:color w:val="1F5E86"/>
-              </w:rPr>
-              <w:t xml:space="preserve">Steven</w:t>
+            <w:shd w:fill="F6E3C5" w:color="auto" w:val="clear"/>
+            <w:tcMar>
+              <w:top w:type="dxa" w:w="70"/>
+              <w:left w:type="dxa" w:w="100"/>
+              <w:bottom w:type="dxa" w:w="70"/>
+              <w:right w:type="dxa" w:w="100"/>
+            </w:tcMar>
+          </w:tcPr>
+          <w:p>
+            <w:pPr>
+              <w:spacing w:after="0"/>
+            </w:pPr>
+            <w:r>
+              <w:rPr>
+                <w:rFonts w:ascii="Calibri" w:cs="Calibri" w:eastAsia="Calibri" w:hAnsi="Calibri"/>
+                <w:b/>
+                <w:bCs/>
+                <w:color w:val="8A4B0F"/>
+              </w:rPr>
+              <w:t xml:space="preserve">Thien Gen</w:t>
             </w:r>
           </w:p>
         </w:tc>
@@ -8250,7 +8263,7 @@
               <w:rPr>
                 <w:rFonts w:ascii="Calibri" w:cs="Calibri" w:eastAsia="Calibri" w:hAnsi="Calibri"/>
               </w:rPr>
-              <w:t xml:space="preserve">Look up a place → Ara Damansara → Search → pick Petaling Jaya, Petaling, Selangor. About 40 s while Thien Gen covers How it works. Then click the Demo button for Ara Damansara.</w:t>
+              <w:t xml:space="preserve">Look up a place → Ara Damansara → Search → pick Petaling Jaya, Petaling, Selangor. About 40 s: talk over it (“it is downloading streets, buildings and bus stops from OpenStreetMap and running the same model”). Then click the Demo button for Ara Damansara.</w:t>
             </w:r>
           </w:p>
         </w:tc>
@@ -8299,26 +8312,26 @@
               <w:bottom w:val="single" w:color="D9CFB6" w:sz="4"/>
               <w:right w:val="single" w:color="D9CFB6" w:sz="4"/>
             </w:tcBorders>
-            <w:shd w:fill="D7EBDD" w:color="auto" w:val="clear"/>
-            <w:tcMar>
-              <w:top w:type="dxa" w:w="70"/>
-              <w:left w:type="dxa" w:w="100"/>
-              <w:bottom w:type="dxa" w:w="70"/>
-              <w:right w:type="dxa" w:w="100"/>
-            </w:tcMar>
-          </w:tcPr>
-          <w:p>
-            <w:pPr>
-              <w:spacing w:after="0"/>
-            </w:pPr>
-            <w:r>
-              <w:rPr>
-                <w:rFonts w:ascii="Calibri" w:cs="Calibri" w:eastAsia="Calibri" w:hAnsi="Calibri"/>
-                <w:b/>
-                <w:bCs/>
-                <w:color w:val="2E7D50"/>
-              </w:rPr>
-              <w:t xml:space="preserve">Both</w:t>
+            <w:shd w:fill="F6E3C5" w:color="auto" w:val="clear"/>
+            <w:tcMar>
+              <w:top w:type="dxa" w:w="70"/>
+              <w:left w:type="dxa" w:w="100"/>
+              <w:bottom w:type="dxa" w:w="70"/>
+              <w:right w:type="dxa" w:w="100"/>
+            </w:tcMar>
+          </w:tcPr>
+          <w:p>
+            <w:pPr>
+              <w:spacing w:after="0"/>
+            </w:pPr>
+            <w:r>
+              <w:rPr>
+                <w:rFonts w:ascii="Calibri" w:cs="Calibri" w:eastAsia="Calibri" w:hAnsi="Calibri"/>
+                <w:b/>
+                <w:bCs/>
+                <w:color w:val="8A4B0F"/>
+              </w:rPr>
+              <w:t xml:space="preserve">Thien Gen</w:t>
             </w:r>
           </w:p>
         </w:tc>
@@ -8376,7 +8389,7 @@
               <w:rPr>
                 <w:rFonts w:ascii="Calibri" w:cs="Calibri" w:eastAsia="Calibri" w:hAnsi="Calibri"/>
               </w:rPr>
-              <w:t xml:space="preserve">Hand the mouse to a judge. Everything recalculates instantly.</w:t>
+              <w:t xml:space="preserve">Hand the mouse to a judge. Everything recalculates instantly. At 7:25 say “Back to Steven”, Alt+Tab to the deck and hand back.</w:t>
             </w:r>
           </w:p>
         </w:tc>
@@ -8425,26 +8438,26 @@
               <w:bottom w:val="single" w:color="D9CFB6" w:sz="4"/>
               <w:right w:val="single" w:color="D9CFB6" w:sz="4"/>
             </w:tcBorders>
-            <w:shd w:fill="F6E3C5" w:color="auto" w:val="clear"/>
-            <w:tcMar>
-              <w:top w:type="dxa" w:w="70"/>
-              <w:left w:type="dxa" w:w="100"/>
-              <w:bottom w:type="dxa" w:w="70"/>
-              <w:right w:type="dxa" w:w="100"/>
-            </w:tcMar>
-          </w:tcPr>
-          <w:p>
-            <w:pPr>
-              <w:spacing w:after="0"/>
-            </w:pPr>
-            <w:r>
-              <w:rPr>
-                <w:rFonts w:ascii="Calibri" w:cs="Calibri" w:eastAsia="Calibri" w:hAnsi="Calibri"/>
-                <w:b/>
-                <w:bCs/>
-                <w:color w:val="8A4B0F"/>
-              </w:rPr>
-              <w:t xml:space="preserve">Thien Gen</w:t>
+            <w:shd w:fill="D8E8F2" w:color="auto" w:val="clear"/>
+            <w:tcMar>
+              <w:top w:type="dxa" w:w="70"/>
+              <w:left w:type="dxa" w:w="100"/>
+              <w:bottom w:type="dxa" w:w="70"/>
+              <w:right w:type="dxa" w:w="100"/>
+            </w:tcMar>
+          </w:tcPr>
+          <w:p>
+            <w:pPr>
+              <w:spacing w:after="0"/>
+            </w:pPr>
+            <w:r>
+              <w:rPr>
+                <w:rFonts w:ascii="Calibri" w:cs="Calibri" w:eastAsia="Calibri" w:hAnsi="Calibri"/>
+                <w:b/>
+                <w:bCs/>
+                <w:color w:val="1F5E86"/>
+              </w:rPr>
+              <w:t xml:space="preserve">Steven</w:t>
             </w:r>
           </w:p>
         </w:tc>
@@ -8474,7 +8487,7 @@
                 <w:i w:val="false"/>
                 <w:iCs w:val="false"/>
               </w:rPr>
-              <w:t xml:space="preserve">Impact, Innovation, Feasibility and Implementation slides, about 40 s each.</w:t>
+              <w:t xml:space="preserve">How it works, Impact, Innovation, Feasibility and Implementation slides, about 30 s each.</w:t>
             </w:r>
           </w:p>
         </w:tc>
@@ -8502,7 +8515,7 @@
               <w:rPr>
                 <w:rFonts w:ascii="Calibri" w:cs="Calibri" w:eastAsia="Calibri" w:hAnsi="Calibri"/>
               </w:rPr>
-              <w:t xml:space="preserve"/>
+              <w:t xml:space="preserve">Advance the slides.</w:t>
             </w:r>
           </w:p>
         </w:tc>
@@ -8551,26 +8564,26 @@
               <w:bottom w:val="single" w:color="D9CFB6" w:sz="4"/>
               <w:right w:val="single" w:color="D9CFB6" w:sz="4"/>
             </w:tcBorders>
-            <w:shd w:fill="D7EBDD" w:color="auto" w:val="clear"/>
-            <w:tcMar>
-              <w:top w:type="dxa" w:w="70"/>
-              <w:left w:type="dxa" w:w="100"/>
-              <w:bottom w:type="dxa" w:w="70"/>
-              <w:right w:type="dxa" w:w="100"/>
-            </w:tcMar>
-          </w:tcPr>
-          <w:p>
-            <w:pPr>
-              <w:spacing w:after="0"/>
-            </w:pPr>
-            <w:r>
-              <w:rPr>
-                <w:rFonts w:ascii="Calibri" w:cs="Calibri" w:eastAsia="Calibri" w:hAnsi="Calibri"/>
-                <w:b/>
-                <w:bCs/>
-                <w:color w:val="2E7D50"/>
-              </w:rPr>
-              <w:t xml:space="preserve">Both</w:t>
+            <w:shd w:fill="D8E8F2" w:color="auto" w:val="clear"/>
+            <w:tcMar>
+              <w:top w:type="dxa" w:w="70"/>
+              <w:left w:type="dxa" w:w="100"/>
+              <w:bottom w:type="dxa" w:w="70"/>
+              <w:right w:type="dxa" w:w="100"/>
+            </w:tcMar>
+          </w:tcPr>
+          <w:p>
+            <w:pPr>
+              <w:spacing w:after="0"/>
+            </w:pPr>
+            <w:r>
+              <w:rPr>
+                <w:rFonts w:ascii="Calibri" w:cs="Calibri" w:eastAsia="Calibri" w:hAnsi="Calibri"/>
+                <w:b/>
+                <w:bCs/>
+                <w:color w:val="1F5E86"/>
+              </w:rPr>
+              <w:t xml:space="preserve">Steven</w:t>
             </w:r>
           </w:p>
         </w:tc>
@@ -8597,10 +8610,10 @@
             <w:r>
               <w:rPr>
                 <w:rFonts w:ascii="Calibri" w:cs="Calibri" w:eastAsia="Calibri" w:hAnsi="Calibri"/>
-                <w:i w:val="false"/>
-                <w:iCs w:val="false"/>
-              </w:rPr>
-              <w:t xml:space="preserve">End. Q&amp;A.</w:t>
+                <w:i/>
+                <w:iCs/>
+              </w:rPr>
+              <w:t xml:space="preserve">“Thank you. We’re happy to take questions.” Q&amp;A: Thien Gen takes the technical ones.</w:t>
             </w:r>
           </w:p>
         </w:tc>
@@ -9389,26 +9402,26 @@
               <w:bottom w:val="single" w:color="D9CFB6" w:sz="4"/>
               <w:right w:val="single" w:color="D9CFB6" w:sz="4"/>
             </w:tcBorders>
-            <w:shd w:fill="D8E8F2" w:color="auto" w:val="clear"/>
-            <w:tcMar>
-              <w:top w:type="dxa" w:w="70"/>
-              <w:left w:type="dxa" w:w="100"/>
-              <w:bottom w:type="dxa" w:w="70"/>
-              <w:right w:type="dxa" w:w="100"/>
-            </w:tcMar>
-          </w:tcPr>
-          <w:p>
-            <w:pPr>
-              <w:spacing w:after="0"/>
-            </w:pPr>
-            <w:r>
-              <w:rPr>
-                <w:rFonts w:ascii="Calibri" w:cs="Calibri" w:eastAsia="Calibri" w:hAnsi="Calibri"/>
-                <w:b/>
-                <w:bCs/>
-                <w:color w:val="1F5E86"/>
-              </w:rPr>
-              <w:t xml:space="preserve">Steven</w:t>
+            <w:shd w:fill="F6E3C5" w:color="auto" w:val="clear"/>
+            <w:tcMar>
+              <w:top w:type="dxa" w:w="70"/>
+              <w:left w:type="dxa" w:w="100"/>
+              <w:bottom w:type="dxa" w:w="70"/>
+              <w:right w:type="dxa" w:w="100"/>
+            </w:tcMar>
+          </w:tcPr>
+          <w:p>
+            <w:pPr>
+              <w:spacing w:after="0"/>
+            </w:pPr>
+            <w:r>
+              <w:rPr>
+                <w:rFonts w:ascii="Calibri" w:cs="Calibri" w:eastAsia="Calibri" w:hAnsi="Calibri"/>
+                <w:b/>
+                <w:bCs/>
+                <w:color w:val="8A4B0F"/>
+              </w:rPr>
+              <w:t xml:space="preserve">Thien Gen</w:t>
             </w:r>
           </w:p>
         </w:tc>
@@ -9484,26 +9497,26 @@
               <w:bottom w:val="single" w:color="D9CFB6" w:sz="4"/>
               <w:right w:val="single" w:color="D9CFB6" w:sz="4"/>
             </w:tcBorders>
-            <w:shd w:fill="F6E3C5" w:color="auto" w:val="clear"/>
-            <w:tcMar>
-              <w:top w:type="dxa" w:w="70"/>
-              <w:left w:type="dxa" w:w="100"/>
-              <w:bottom w:type="dxa" w:w="70"/>
-              <w:right w:type="dxa" w:w="100"/>
-            </w:tcMar>
-          </w:tcPr>
-          <w:p>
-            <w:pPr>
-              <w:spacing w:after="0"/>
-            </w:pPr>
-            <w:r>
-              <w:rPr>
-                <w:rFonts w:ascii="Calibri" w:cs="Calibri" w:eastAsia="Calibri" w:hAnsi="Calibri"/>
-                <w:b/>
-                <w:bCs/>
-                <w:color w:val="8A4B0F"/>
-              </w:rPr>
-              <w:t xml:space="preserve">Thien Gen</w:t>
+            <w:shd w:fill="D8E8F2" w:color="auto" w:val="clear"/>
+            <w:tcMar>
+              <w:top w:type="dxa" w:w="70"/>
+              <w:left w:type="dxa" w:w="100"/>
+              <w:bottom w:type="dxa" w:w="70"/>
+              <w:right w:type="dxa" w:w="100"/>
+            </w:tcMar>
+          </w:tcPr>
+          <w:p>
+            <w:pPr>
+              <w:spacing w:after="0"/>
+            </w:pPr>
+            <w:r>
+              <w:rPr>
+                <w:rFonts w:ascii="Calibri" w:cs="Calibri" w:eastAsia="Calibri" w:hAnsi="Calibri"/>
+                <w:b/>
+                <w:bCs/>
+                <w:color w:val="1F5E86"/>
+              </w:rPr>
+              <w:t xml:space="preserve">Steven</w:t>
             </w:r>
           </w:p>
         </w:tc>
@@ -9579,26 +9592,26 @@
               <w:bottom w:val="single" w:color="D9CFB6" w:sz="4"/>
               <w:right w:val="single" w:color="D9CFB6" w:sz="4"/>
             </w:tcBorders>
-            <w:shd w:fill="F6E3C5" w:color="auto" w:val="clear"/>
-            <w:tcMar>
-              <w:top w:type="dxa" w:w="70"/>
-              <w:left w:type="dxa" w:w="100"/>
-              <w:bottom w:type="dxa" w:w="70"/>
-              <w:right w:type="dxa" w:w="100"/>
-            </w:tcMar>
-          </w:tcPr>
-          <w:p>
-            <w:pPr>
-              <w:spacing w:after="0"/>
-            </w:pPr>
-            <w:r>
-              <w:rPr>
-                <w:rFonts w:ascii="Calibri" w:cs="Calibri" w:eastAsia="Calibri" w:hAnsi="Calibri"/>
-                <w:b/>
-                <w:bCs/>
-                <w:color w:val="8A4B0F"/>
-              </w:rPr>
-              <w:t xml:space="preserve">Thien Gen</w:t>
+            <w:shd w:fill="D8E8F2" w:color="auto" w:val="clear"/>
+            <w:tcMar>
+              <w:top w:type="dxa" w:w="70"/>
+              <w:left w:type="dxa" w:w="100"/>
+              <w:bottom w:type="dxa" w:w="70"/>
+              <w:right w:type="dxa" w:w="100"/>
+            </w:tcMar>
+          </w:tcPr>
+          <w:p>
+            <w:pPr>
+              <w:spacing w:after="0"/>
+            </w:pPr>
+            <w:r>
+              <w:rPr>
+                <w:rFonts w:ascii="Calibri" w:cs="Calibri" w:eastAsia="Calibri" w:hAnsi="Calibri"/>
+                <w:b/>
+                <w:bCs/>
+                <w:color w:val="1F5E86"/>
+              </w:rPr>
+              <w:t xml:space="preserve">Steven</w:t>
             </w:r>
           </w:p>
         </w:tc>
@@ -9674,26 +9687,26 @@
               <w:bottom w:val="single" w:color="D9CFB6" w:sz="4"/>
               <w:right w:val="single" w:color="D9CFB6" w:sz="4"/>
             </w:tcBorders>
-            <w:shd w:fill="F6E3C5" w:color="auto" w:val="clear"/>
-            <w:tcMar>
-              <w:top w:type="dxa" w:w="70"/>
-              <w:left w:type="dxa" w:w="100"/>
-              <w:bottom w:type="dxa" w:w="70"/>
-              <w:right w:type="dxa" w:w="100"/>
-            </w:tcMar>
-          </w:tcPr>
-          <w:p>
-            <w:pPr>
-              <w:spacing w:after="0"/>
-            </w:pPr>
-            <w:r>
-              <w:rPr>
-                <w:rFonts w:ascii="Calibri" w:cs="Calibri" w:eastAsia="Calibri" w:hAnsi="Calibri"/>
-                <w:b/>
-                <w:bCs/>
-                <w:color w:val="8A4B0F"/>
-              </w:rPr>
-              <w:t xml:space="preserve">Thien Gen</w:t>
+            <w:shd w:fill="D8E8F2" w:color="auto" w:val="clear"/>
+            <w:tcMar>
+              <w:top w:type="dxa" w:w="70"/>
+              <w:left w:type="dxa" w:w="100"/>
+              <w:bottom w:type="dxa" w:w="70"/>
+              <w:right w:type="dxa" w:w="100"/>
+            </w:tcMar>
+          </w:tcPr>
+          <w:p>
+            <w:pPr>
+              <w:spacing w:after="0"/>
+            </w:pPr>
+            <w:r>
+              <w:rPr>
+                <w:rFonts w:ascii="Calibri" w:cs="Calibri" w:eastAsia="Calibri" w:hAnsi="Calibri"/>
+                <w:b/>
+                <w:bCs/>
+                <w:color w:val="1F5E86"/>
+              </w:rPr>
+              <w:t xml:space="preserve">Steven</w:t>
             </w:r>
           </w:p>
         </w:tc>
@@ -9769,26 +9782,26 @@
               <w:bottom w:val="single" w:color="D9CFB6" w:sz="4"/>
               <w:right w:val="single" w:color="D9CFB6" w:sz="4"/>
             </w:tcBorders>
-            <w:shd w:fill="D8E8F2" w:color="auto" w:val="clear"/>
-            <w:tcMar>
-              <w:top w:type="dxa" w:w="70"/>
-              <w:left w:type="dxa" w:w="100"/>
-              <w:bottom w:type="dxa" w:w="70"/>
-              <w:right w:type="dxa" w:w="100"/>
-            </w:tcMar>
-          </w:tcPr>
-          <w:p>
-            <w:pPr>
-              <w:spacing w:after="0"/>
-            </w:pPr>
-            <w:r>
-              <w:rPr>
-                <w:rFonts w:ascii="Calibri" w:cs="Calibri" w:eastAsia="Calibri" w:hAnsi="Calibri"/>
-                <w:b/>
-                <w:bCs/>
-                <w:color w:val="1F5E86"/>
-              </w:rPr>
-              <w:t xml:space="preserve">Steven</w:t>
+            <w:shd w:fill="F6E3C5" w:color="auto" w:val="clear"/>
+            <w:tcMar>
+              <w:top w:type="dxa" w:w="70"/>
+              <w:left w:type="dxa" w:w="100"/>
+              <w:bottom w:type="dxa" w:w="70"/>
+              <w:right w:type="dxa" w:w="100"/>
+            </w:tcMar>
+          </w:tcPr>
+          <w:p>
+            <w:pPr>
+              <w:spacing w:after="0"/>
+            </w:pPr>
+            <w:r>
+              <w:rPr>
+                <w:rFonts w:ascii="Calibri" w:cs="Calibri" w:eastAsia="Calibri" w:hAnsi="Calibri"/>
+                <w:b/>
+                <w:bCs/>
+                <w:color w:val="8A4B0F"/>
+              </w:rPr>
+              <w:t xml:space="preserve">Thien Gen</w:t>
             </w:r>
           </w:p>
         </w:tc>
@@ -9864,26 +9877,26 @@
               <w:bottom w:val="single" w:color="D9CFB6" w:sz="4"/>
               <w:right w:val="single" w:color="D9CFB6" w:sz="4"/>
             </w:tcBorders>
-            <w:shd w:fill="D8E8F2" w:color="auto" w:val="clear"/>
-            <w:tcMar>
-              <w:top w:type="dxa" w:w="70"/>
-              <w:left w:type="dxa" w:w="100"/>
-              <w:bottom w:type="dxa" w:w="70"/>
-              <w:right w:type="dxa" w:w="100"/>
-            </w:tcMar>
-          </w:tcPr>
-          <w:p>
-            <w:pPr>
-              <w:spacing w:after="0"/>
-            </w:pPr>
-            <w:r>
-              <w:rPr>
-                <w:rFonts w:ascii="Calibri" w:cs="Calibri" w:eastAsia="Calibri" w:hAnsi="Calibri"/>
-                <w:b/>
-                <w:bCs/>
-                <w:color w:val="1F5E86"/>
-              </w:rPr>
-              <w:t xml:space="preserve">Steven</w:t>
+            <w:shd w:fill="F6E3C5" w:color="auto" w:val="clear"/>
+            <w:tcMar>
+              <w:top w:type="dxa" w:w="70"/>
+              <w:left w:type="dxa" w:w="100"/>
+              <w:bottom w:type="dxa" w:w="70"/>
+              <w:right w:type="dxa" w:w="100"/>
+            </w:tcMar>
+          </w:tcPr>
+          <w:p>
+            <w:pPr>
+              <w:spacing w:after="0"/>
+            </w:pPr>
+            <w:r>
+              <w:rPr>
+                <w:rFonts w:ascii="Calibri" w:cs="Calibri" w:eastAsia="Calibri" w:hAnsi="Calibri"/>
+                <w:b/>
+                <w:bCs/>
+                <w:color w:val="8A4B0F"/>
+              </w:rPr>
+              <w:t xml:space="preserve">Thien Gen</w:t>
             </w:r>
           </w:p>
         </w:tc>
@@ -9959,26 +9972,26 @@
               <w:bottom w:val="single" w:color="D9CFB6" w:sz="4"/>
               <w:right w:val="single" w:color="D9CFB6" w:sz="4"/>
             </w:tcBorders>
-            <w:shd w:fill="D8E8F2" w:color="auto" w:val="clear"/>
-            <w:tcMar>
-              <w:top w:type="dxa" w:w="70"/>
-              <w:left w:type="dxa" w:w="100"/>
-              <w:bottom w:type="dxa" w:w="70"/>
-              <w:right w:type="dxa" w:w="100"/>
-            </w:tcMar>
-          </w:tcPr>
-          <w:p>
-            <w:pPr>
-              <w:spacing w:after="0"/>
-            </w:pPr>
-            <w:r>
-              <w:rPr>
-                <w:rFonts w:ascii="Calibri" w:cs="Calibri" w:eastAsia="Calibri" w:hAnsi="Calibri"/>
-                <w:b/>
-                <w:bCs/>
-                <w:color w:val="1F5E86"/>
-              </w:rPr>
-              <w:t xml:space="preserve">Steven</w:t>
+            <w:shd w:fill="F6E3C5" w:color="auto" w:val="clear"/>
+            <w:tcMar>
+              <w:top w:type="dxa" w:w="70"/>
+              <w:left w:type="dxa" w:w="100"/>
+              <w:bottom w:type="dxa" w:w="70"/>
+              <w:right w:type="dxa" w:w="100"/>
+            </w:tcMar>
+          </w:tcPr>
+          <w:p>
+            <w:pPr>
+              <w:spacing w:after="0"/>
+            </w:pPr>
+            <w:r>
+              <w:rPr>
+                <w:rFonts w:ascii="Calibri" w:cs="Calibri" w:eastAsia="Calibri" w:hAnsi="Calibri"/>
+                <w:b/>
+                <w:bCs/>
+                <w:color w:val="8A4B0F"/>
+              </w:rPr>
+              <w:t xml:space="preserve">Thien Gen</w:t>
             </w:r>
           </w:p>
         </w:tc>
@@ -10054,26 +10067,26 @@
               <w:bottom w:val="single" w:color="D9CFB6" w:sz="4"/>
               <w:right w:val="single" w:color="D9CFB6" w:sz="4"/>
             </w:tcBorders>
-            <w:shd w:fill="F6E3C5" w:color="auto" w:val="clear"/>
-            <w:tcMar>
-              <w:top w:type="dxa" w:w="70"/>
-              <w:left w:type="dxa" w:w="100"/>
-              <w:bottom w:type="dxa" w:w="70"/>
-              <w:right w:type="dxa" w:w="100"/>
-            </w:tcMar>
-          </w:tcPr>
-          <w:p>
-            <w:pPr>
-              <w:spacing w:after="0"/>
-            </w:pPr>
-            <w:r>
-              <w:rPr>
-                <w:rFonts w:ascii="Calibri" w:cs="Calibri" w:eastAsia="Calibri" w:hAnsi="Calibri"/>
-                <w:b/>
-                <w:bCs/>
-                <w:color w:val="8A4B0F"/>
-              </w:rPr>
-              <w:t xml:space="preserve">Thien Gen</w:t>
+            <w:shd w:fill="D8E8F2" w:color="auto" w:val="clear"/>
+            <w:tcMar>
+              <w:top w:type="dxa" w:w="70"/>
+              <w:left w:type="dxa" w:w="100"/>
+              <w:bottom w:type="dxa" w:w="70"/>
+              <w:right w:type="dxa" w:w="100"/>
+            </w:tcMar>
+          </w:tcPr>
+          <w:p>
+            <w:pPr>
+              <w:spacing w:after="0"/>
+            </w:pPr>
+            <w:r>
+              <w:rPr>
+                <w:rFonts w:ascii="Calibri" w:cs="Calibri" w:eastAsia="Calibri" w:hAnsi="Calibri"/>
+                <w:b/>
+                <w:bCs/>
+                <w:color w:val="1F5E86"/>
+              </w:rPr>
+              <w:t xml:space="preserve">Steven</w:t>
             </w:r>
           </w:p>
         </w:tc>
@@ -10163,7 +10176,7 @@
         <w:rPr>
           <w:rFonts w:ascii="Calibri" w:cs="Calibri" w:eastAsia="Calibri" w:hAnsi="Calibri"/>
         </w:rPr>
-        <w:t xml:space="preserve">Fill [Team name] and [University] on the cover slide and in the opening line.</w:t>
+        <w:t xml:space="preserve">Check the names on the cover slide and in the opening line.</w:t>
       </w:r>
     </w:p>
     <w:p>

</xml_diff>